<commit_message>
Replace repository with evolved learning publisher source
</commit_message>
<xml_diff>
--- a/imports/outbreak_ve_demo/docx/01_vaccine_effectiveness_outbreak.docx
+++ b/imports/outbreak_ve_demo/docx/01_vaccine_effectiveness_outbreak.docx
@@ -506,19 +506,11 @@
           <w:rFonts w:ascii="Calibri" w:hAnsi="Calibri" w:cs="Calibri"/>
         </w:rPr>
       </w:pPr>
-      <w:proofErr w:type="gramStart"/>
-      <w:r>
-        <w:rPr>
-          <w:rFonts w:ascii="Calibri" w:hAnsi="Calibri" w:cs="Calibri"/>
-        </w:rPr>
-        <w:t>Callout :</w:t>
-      </w:r>
-      <w:proofErr w:type="gramEnd"/>
-      <w:r>
-        <w:rPr>
-          <w:rFonts w:ascii="Calibri" w:hAnsi="Calibri" w:cs="Calibri"/>
-        </w:rPr>
-        <w:t>: important</w:t>
+      <w:r>
+        <w:rPr>
+          <w:rFonts w:ascii="Calibri" w:hAnsi="Calibri" w:cs="Calibri"/>
+        </w:rPr>
+        <w:t>Callout :: important</w:t>
       </w:r>
     </w:p>
     <w:p>
@@ -533,20 +525,7 @@
         </w:rPr>
         <w:lastRenderedPageBreak/>
         <w:br/>
-      </w:r>
-      <w:proofErr w:type="gramStart"/>
-      <w:r>
-        <w:rPr>
-          <w:rFonts w:ascii="Calibri" w:hAnsi="Calibri" w:cs="Calibri"/>
-        </w:rPr>
-        <w:t>Text :</w:t>
-      </w:r>
-      <w:proofErr w:type="gramEnd"/>
-      <w:r>
-        <w:rPr>
-          <w:rFonts w:ascii="Calibri" w:hAnsi="Calibri" w:cs="Calibri"/>
-        </w:rPr>
-        <w:t>: Vaccine effectiveness measures the reduction in disease risk among vaccinated individuals compared to unvaccinated individuals in real-world conditions.</w:t>
+        <w:t>Text :: Vaccine effectiveness measures the reduction in disease risk among vaccinated individuals compared to unvaccinated individuals in real-world conditions.</w:t>
       </w:r>
     </w:p>
     <w:p>
@@ -927,21 +906,7 @@
           <w:rFonts w:ascii="Calibri" w:hAnsi="Calibri" w:cs="Calibri"/>
         </w:rPr>
         <w:br/>
-        <w:t xml:space="preserve">Step </w:t>
-      </w:r>
-      <w:proofErr w:type="gramStart"/>
-      <w:r>
-        <w:rPr>
-          <w:rFonts w:ascii="Calibri" w:hAnsi="Calibri" w:cs="Calibri"/>
-        </w:rPr>
-        <w:t>1 :</w:t>
-      </w:r>
-      <w:proofErr w:type="gramEnd"/>
-      <w:r>
-        <w:rPr>
-          <w:rFonts w:ascii="Calibri" w:hAnsi="Calibri" w:cs="Calibri"/>
-        </w:rPr>
-        <w:t>: Calculate risk in the vaccinated group: 5 / 500 = 0.01</w:t>
+        <w:t>Step 1 :: Calculate risk in the vaccinated group: 5 / 500 = 0.01</w:t>
       </w:r>
       <w:r>
         <w:rPr>
@@ -1012,20 +977,7 @@
           <w:rFonts w:ascii="Calibri" w:hAnsi="Calibri" w:cs="Calibri"/>
         </w:rPr>
         <w:br/>
-      </w:r>
-      <w:proofErr w:type="gramStart"/>
-      <w:r>
-        <w:rPr>
-          <w:rFonts w:ascii="Calibri" w:hAnsi="Calibri" w:cs="Calibri"/>
-        </w:rPr>
-        <w:t>Question :</w:t>
-      </w:r>
-      <w:proofErr w:type="gramEnd"/>
-      <w:r>
-        <w:rPr>
-          <w:rFonts w:ascii="Calibri" w:hAnsi="Calibri" w:cs="Calibri"/>
-        </w:rPr>
-        <w:t>: Why might vaccine effectiveness differ between populations?</w:t>
+        <w:t>Question :: Why might vaccine effectiveness differ between populations?</w:t>
       </w:r>
       <w:r>
         <w:rPr>
@@ -1045,8 +997,14 @@
     <w:p>
       <w:pPr>
         <w:pStyle w:val="Heading2"/>
-      </w:pPr>
-      <w:r>
+        <w:rPr>
+          <w:rFonts w:ascii="Calibri" w:hAnsi="Calibri" w:cs="Calibri"/>
+        </w:rPr>
+      </w:pPr>
+      <w:r>
+        <w:rPr>
+          <w:rFonts w:ascii="Calibri" w:hAnsi="Calibri" w:cs="Calibri"/>
+        </w:rPr>
         <w:t>Youtube</w:t>
       </w:r>
     </w:p>
@@ -1057,7 +1015,6 @@
         </w:rPr>
       </w:pPr>
       <w:proofErr w:type="spellStart"/>
-      <w:proofErr w:type="gramStart"/>
       <w:r>
         <w:rPr>
           <w:rFonts w:ascii="Calibri" w:hAnsi="Calibri" w:cs="Calibri"/>
@@ -1069,14 +1026,7 @@
         <w:rPr>
           <w:rFonts w:ascii="Calibri" w:hAnsi="Calibri" w:cs="Calibri"/>
         </w:rPr>
-        <w:t xml:space="preserve"> :</w:t>
-      </w:r>
-      <w:proofErr w:type="gramEnd"/>
-      <w:r>
-        <w:rPr>
-          <w:rFonts w:ascii="Calibri" w:hAnsi="Calibri" w:cs="Calibri"/>
-        </w:rPr>
-        <w:t>: https://www.youtube.com/watch?v=yt3e8Ng0mf0</w:t>
+        <w:t xml:space="preserve"> :: https://www.youtube.com/watch?v=yt3e8Ng0mf0</w:t>
       </w:r>
     </w:p>
     <w:p>
@@ -1103,11 +1053,797 @@
     <w:p>
       <w:pPr>
         <w:pStyle w:val="Heading2"/>
-      </w:pPr>
-      <w:r>
+        <w:rPr>
+          <w:rFonts w:ascii="Calibri" w:hAnsi="Calibri" w:cs="Calibri"/>
+        </w:rPr>
+      </w:pPr>
+    </w:p>
+    <w:p>
+      <w:pPr>
+        <w:pStyle w:val="Heading2"/>
+        <w:rPr>
+          <w:rFonts w:ascii="Calibri" w:hAnsi="Calibri" w:cs="Calibri"/>
+        </w:rPr>
+      </w:pPr>
+      <w:r>
+        <w:rPr>
+          <w:rFonts w:ascii="Calibri" w:hAnsi="Calibri" w:cs="Calibri"/>
+        </w:rPr>
+        <w:t>R Code Demos</w:t>
+      </w:r>
+      <w:r>
+        <w:rPr>
+          <w:rFonts w:ascii="Calibri" w:hAnsi="Calibri" w:cs="Calibri"/>
+        </w:rPr>
+        <w:br/>
+      </w:r>
+      <w:r>
+        <w:rPr>
+          <w:rFonts w:ascii="Calibri" w:hAnsi="Calibri" w:cs="Calibri"/>
+        </w:rPr>
+        <w:br/>
+        <w:t xml:space="preserve">R </w:t>
+      </w:r>
+      <w:r>
+        <w:rPr>
+          <w:rFonts w:ascii="Calibri" w:hAnsi="Calibri" w:cs="Calibri"/>
+        </w:rPr>
+        <w:t>Code and Output</w:t>
+      </w:r>
+    </w:p>
+    <w:p>
+      <w:pPr>
+        <w:rPr>
+          <w:rFonts w:ascii="Calibri" w:hAnsi="Calibri" w:cs="Calibri"/>
+        </w:rPr>
+      </w:pPr>
+    </w:p>
+    <w:p>
+      <w:pPr>
+        <w:rPr>
+          <w:rFonts w:ascii="Calibri" w:hAnsi="Calibri" w:cs="Calibri"/>
+        </w:rPr>
+      </w:pPr>
+      <w:r>
+        <w:rPr>
+          <w:rFonts w:ascii="Calibri" w:hAnsi="Calibri" w:cs="Calibri"/>
+        </w:rPr>
+        <w:t>R Code</w:t>
+      </w:r>
+    </w:p>
+    <w:p>
+      <w:pPr>
+        <w:rPr>
+          <w:rFonts w:ascii="Calibri" w:hAnsi="Calibri" w:cs="Calibri"/>
+        </w:rPr>
+      </w:pPr>
+      <w:r>
+        <w:rPr>
+          <w:rFonts w:ascii="Calibri" w:hAnsi="Calibri" w:cs="Calibri"/>
+        </w:rPr>
+        <w:t>R Mode :: static</w:t>
+      </w:r>
+    </w:p>
+    <w:p>
+      <w:pPr>
+        <w:rPr>
+          <w:rFonts w:ascii="Calibri" w:hAnsi="Calibri" w:cs="Calibri"/>
+        </w:rPr>
+      </w:pPr>
+      <w:r>
+        <w:rPr>
+          <w:rFonts w:ascii="Calibri" w:hAnsi="Calibri" w:cs="Calibri"/>
+        </w:rPr>
+        <w:t>Echo :: true</w:t>
+      </w:r>
+    </w:p>
+    <w:p>
+      <w:pPr>
+        <w:rPr>
+          <w:rFonts w:ascii="Calibri" w:hAnsi="Calibri" w:cs="Calibri"/>
+        </w:rPr>
+      </w:pPr>
+      <w:r>
+        <w:rPr>
+          <w:rFonts w:ascii="Calibri" w:hAnsi="Calibri" w:cs="Calibri"/>
+        </w:rPr>
+        <w:t>Output :: true</w:t>
+      </w:r>
+    </w:p>
+    <w:p>
+      <w:pPr>
+        <w:rPr>
+          <w:rFonts w:ascii="Calibri" w:hAnsi="Calibri" w:cs="Calibri"/>
+        </w:rPr>
+      </w:pPr>
+      <w:r>
+        <w:rPr>
+          <w:rFonts w:ascii="Calibri" w:hAnsi="Calibri" w:cs="Calibri"/>
+        </w:rPr>
+        <w:t>Alt :: Bar chart showing risk of infection for vaccinated and unvaccinated groups.</w:t>
+      </w:r>
+    </w:p>
+    <w:p>
+      <w:pPr>
+        <w:rPr>
+          <w:rFonts w:ascii="Calibri" w:hAnsi="Calibri" w:cs="Calibri"/>
+        </w:rPr>
+      </w:pPr>
+      <w:r>
+        <w:rPr>
+          <w:rFonts w:ascii="Calibri" w:hAnsi="Calibri" w:cs="Calibri"/>
+        </w:rPr>
+        <w:t>Caption :: Risk of Infection by Vaccination Status</w:t>
+      </w:r>
+    </w:p>
+    <w:p>
+      <w:pPr>
+        <w:rPr>
+          <w:rFonts w:ascii="Calibri" w:hAnsi="Calibri" w:cs="Calibri"/>
+        </w:rPr>
+      </w:pPr>
+    </w:p>
+    <w:p>
+      <w:pPr>
+        <w:rPr>
+          <w:rFonts w:ascii="Calibri" w:hAnsi="Calibri" w:cs="Calibri"/>
+        </w:rPr>
+      </w:pPr>
+      <w:r>
+        <w:rPr>
+          <w:rFonts w:ascii="Calibri" w:hAnsi="Calibri" w:cs="Calibri"/>
+        </w:rPr>
+        <w:t>group &lt;- c("Vaccinated", "Unvaccinated")</w:t>
+      </w:r>
+    </w:p>
+    <w:p>
+      <w:pPr>
+        <w:rPr>
+          <w:rFonts w:ascii="Calibri" w:hAnsi="Calibri" w:cs="Calibri"/>
+        </w:rPr>
+      </w:pPr>
+      <w:r>
+        <w:rPr>
+          <w:rFonts w:ascii="Calibri" w:hAnsi="Calibri" w:cs="Calibri"/>
+        </w:rPr>
+        <w:t>cases &lt;- c(5, 25)</w:t>
+      </w:r>
+    </w:p>
+    <w:p>
+      <w:pPr>
+        <w:rPr>
+          <w:rFonts w:ascii="Calibri" w:hAnsi="Calibri" w:cs="Calibri"/>
+        </w:rPr>
+      </w:pPr>
+      <w:r>
+        <w:rPr>
+          <w:rFonts w:ascii="Calibri" w:hAnsi="Calibri" w:cs="Calibri"/>
+        </w:rPr>
+        <w:t>population &lt;- c(500, 500)</w:t>
+      </w:r>
+    </w:p>
+    <w:p>
+      <w:pPr>
+        <w:rPr>
+          <w:rFonts w:ascii="Calibri" w:hAnsi="Calibri" w:cs="Calibri"/>
+        </w:rPr>
+      </w:pPr>
+      <w:r>
+        <w:rPr>
+          <w:rFonts w:ascii="Calibri" w:hAnsi="Calibri" w:cs="Calibri"/>
+        </w:rPr>
+        <w:t>risk &lt;- cases / population</w:t>
+      </w:r>
+    </w:p>
+    <w:p>
+      <w:pPr>
+        <w:rPr>
+          <w:rFonts w:ascii="Calibri" w:hAnsi="Calibri" w:cs="Calibri"/>
+        </w:rPr>
+      </w:pPr>
+    </w:p>
+    <w:p>
+      <w:pPr>
+        <w:rPr>
+          <w:rFonts w:ascii="Calibri" w:hAnsi="Calibri" w:cs="Calibri"/>
+        </w:rPr>
+      </w:pPr>
+      <w:proofErr w:type="spellStart"/>
+      <w:r>
+        <w:rPr>
+          <w:rFonts w:ascii="Calibri" w:hAnsi="Calibri" w:cs="Calibri"/>
+        </w:rPr>
+        <w:t>barplot</w:t>
+      </w:r>
+      <w:proofErr w:type="spellEnd"/>
+      <w:r>
+        <w:rPr>
+          <w:rFonts w:ascii="Calibri" w:hAnsi="Calibri" w:cs="Calibri"/>
+        </w:rPr>
+        <w:t>(</w:t>
+      </w:r>
+    </w:p>
+    <w:p>
+      <w:pPr>
+        <w:rPr>
+          <w:rFonts w:ascii="Calibri" w:hAnsi="Calibri" w:cs="Calibri"/>
+        </w:rPr>
+      </w:pPr>
+      <w:r>
+        <w:rPr>
+          <w:rFonts w:ascii="Calibri" w:hAnsi="Calibri" w:cs="Calibri"/>
+        </w:rPr>
+        <w:t>risk,</w:t>
+      </w:r>
+    </w:p>
+    <w:p>
+      <w:pPr>
+        <w:rPr>
+          <w:rFonts w:ascii="Calibri" w:hAnsi="Calibri" w:cs="Calibri"/>
+        </w:rPr>
+      </w:pPr>
+      <w:proofErr w:type="spellStart"/>
+      <w:r>
+        <w:rPr>
+          <w:rFonts w:ascii="Calibri" w:hAnsi="Calibri" w:cs="Calibri"/>
+        </w:rPr>
+        <w:t>names.arg</w:t>
+      </w:r>
+      <w:proofErr w:type="spellEnd"/>
+      <w:r>
+        <w:rPr>
+          <w:rFonts w:ascii="Calibri" w:hAnsi="Calibri" w:cs="Calibri"/>
+        </w:rPr>
+        <w:t xml:space="preserve"> = group,</w:t>
+      </w:r>
+    </w:p>
+    <w:p>
+      <w:pPr>
+        <w:rPr>
+          <w:rFonts w:ascii="Calibri" w:hAnsi="Calibri" w:cs="Calibri"/>
+        </w:rPr>
+      </w:pPr>
+      <w:r>
+        <w:rPr>
+          <w:rFonts w:ascii="Calibri" w:hAnsi="Calibri" w:cs="Calibri"/>
+        </w:rPr>
+        <w:t>col = c("</w:t>
+      </w:r>
+      <w:proofErr w:type="spellStart"/>
+      <w:r>
+        <w:rPr>
+          <w:rFonts w:ascii="Calibri" w:hAnsi="Calibri" w:cs="Calibri"/>
+        </w:rPr>
+        <w:t>steelblue</w:t>
+      </w:r>
+      <w:proofErr w:type="spellEnd"/>
+      <w:r>
+        <w:rPr>
+          <w:rFonts w:ascii="Calibri" w:hAnsi="Calibri" w:cs="Calibri"/>
+        </w:rPr>
+        <w:t>", "tomato"),</w:t>
+      </w:r>
+    </w:p>
+    <w:p>
+      <w:pPr>
+        <w:rPr>
+          <w:rFonts w:ascii="Calibri" w:hAnsi="Calibri" w:cs="Calibri"/>
+        </w:rPr>
+      </w:pPr>
+      <w:r>
+        <w:rPr>
+          <w:rFonts w:ascii="Calibri" w:hAnsi="Calibri" w:cs="Calibri"/>
+        </w:rPr>
+        <w:t>main = "Risk of Infection by Vaccination Status"</w:t>
+      </w:r>
+    </w:p>
+    <w:p>
+      <w:pPr>
+        <w:rPr>
+          <w:rFonts w:ascii="Calibri" w:hAnsi="Calibri" w:cs="Calibri"/>
+        </w:rPr>
+      </w:pPr>
+      <w:r>
+        <w:rPr>
+          <w:rFonts w:ascii="Calibri" w:hAnsi="Calibri" w:cs="Calibri"/>
+        </w:rPr>
+        <w:t>)</w:t>
+      </w:r>
+    </w:p>
+    <w:p>
+      <w:pPr>
+        <w:rPr>
+          <w:rFonts w:ascii="Calibri" w:hAnsi="Calibri" w:cs="Calibri"/>
+        </w:rPr>
+      </w:pPr>
+    </w:p>
+    <w:p>
+      <w:pPr>
+        <w:rPr>
+          <w:rFonts w:ascii="Calibri" w:hAnsi="Calibri" w:cs="Calibri"/>
+        </w:rPr>
+      </w:pPr>
+      <w:r>
+        <w:rPr>
+          <w:rFonts w:ascii="Calibri" w:hAnsi="Calibri" w:cs="Calibri"/>
+        </w:rPr>
+        <w:t>END R Code</w:t>
+      </w:r>
+    </w:p>
+    <w:p>
+      <w:pPr>
+        <w:rPr>
+          <w:rFonts w:ascii="Calibri" w:hAnsi="Calibri" w:cs="Calibri"/>
+        </w:rPr>
+      </w:pPr>
+    </w:p>
+    <w:p>
+      <w:pPr>
+        <w:rPr>
+          <w:rFonts w:ascii="Calibri" w:hAnsi="Calibri" w:cs="Calibri"/>
+        </w:rPr>
+      </w:pPr>
+    </w:p>
+    <w:p>
+      <w:pPr>
+        <w:rPr>
+          <w:rFonts w:ascii="Calibri" w:hAnsi="Calibri" w:cs="Calibri"/>
+        </w:rPr>
+      </w:pPr>
+    </w:p>
+    <w:p>
+      <w:pPr>
+        <w:pStyle w:val="Heading2"/>
+        <w:rPr>
+          <w:rFonts w:ascii="Calibri" w:hAnsi="Calibri" w:cs="Calibri"/>
+        </w:rPr>
+      </w:pPr>
+      <w:r>
+        <w:rPr>
+          <w:rFonts w:ascii="Calibri" w:hAnsi="Calibri" w:cs="Calibri"/>
+        </w:rPr>
+        <w:t>R Code Only</w:t>
+      </w:r>
+    </w:p>
+    <w:p>
+      <w:pPr>
+        <w:rPr>
+          <w:rFonts w:ascii="Calibri" w:hAnsi="Calibri" w:cs="Calibri"/>
+        </w:rPr>
+      </w:pPr>
+    </w:p>
+    <w:p>
+      <w:pPr>
+        <w:rPr>
+          <w:rFonts w:ascii="Calibri" w:hAnsi="Calibri" w:cs="Calibri"/>
+        </w:rPr>
+      </w:pPr>
+      <w:r>
+        <w:rPr>
+          <w:rFonts w:ascii="Calibri" w:hAnsi="Calibri" w:cs="Calibri"/>
+        </w:rPr>
+        <w:t>R Code</w:t>
+      </w:r>
+    </w:p>
+    <w:p>
+      <w:pPr>
+        <w:rPr>
+          <w:rFonts w:ascii="Calibri" w:hAnsi="Calibri" w:cs="Calibri"/>
+        </w:rPr>
+      </w:pPr>
+      <w:r>
+        <w:rPr>
+          <w:rFonts w:ascii="Calibri" w:hAnsi="Calibri" w:cs="Calibri"/>
+        </w:rPr>
+        <w:t>R Mode :: static</w:t>
+      </w:r>
+    </w:p>
+    <w:p>
+      <w:pPr>
+        <w:rPr>
+          <w:rFonts w:ascii="Calibri" w:hAnsi="Calibri" w:cs="Calibri"/>
+        </w:rPr>
+      </w:pPr>
+      <w:r>
+        <w:rPr>
+          <w:rFonts w:ascii="Calibri" w:hAnsi="Calibri" w:cs="Calibri"/>
+        </w:rPr>
+        <w:t>Echo :: true</w:t>
+      </w:r>
+    </w:p>
+    <w:p>
+      <w:pPr>
+        <w:rPr>
+          <w:rFonts w:ascii="Calibri" w:hAnsi="Calibri" w:cs="Calibri"/>
+        </w:rPr>
+      </w:pPr>
+      <w:r>
+        <w:rPr>
+          <w:rFonts w:ascii="Calibri" w:hAnsi="Calibri" w:cs="Calibri"/>
+        </w:rPr>
+        <w:t>Output :: false</w:t>
+      </w:r>
+    </w:p>
+    <w:p>
+      <w:pPr>
+        <w:rPr>
+          <w:rFonts w:ascii="Calibri" w:hAnsi="Calibri" w:cs="Calibri"/>
+        </w:rPr>
+      </w:pPr>
+    </w:p>
+    <w:p>
+      <w:pPr>
+        <w:rPr>
+          <w:rFonts w:ascii="Calibri" w:hAnsi="Calibri" w:cs="Calibri"/>
+        </w:rPr>
+      </w:pPr>
+      <w:r>
+        <w:rPr>
+          <w:rFonts w:ascii="Calibri" w:hAnsi="Calibri" w:cs="Calibri"/>
+        </w:rPr>
+        <w:t>group &lt;- c("Vaccinated", "Unvaccinated")</w:t>
+      </w:r>
+    </w:p>
+    <w:p>
+      <w:pPr>
+        <w:rPr>
+          <w:rFonts w:ascii="Calibri" w:hAnsi="Calibri" w:cs="Calibri"/>
+        </w:rPr>
+      </w:pPr>
+      <w:r>
+        <w:rPr>
+          <w:rFonts w:ascii="Calibri" w:hAnsi="Calibri" w:cs="Calibri"/>
+        </w:rPr>
+        <w:t>cases &lt;- c(5, 25)</w:t>
+      </w:r>
+    </w:p>
+    <w:p>
+      <w:pPr>
+        <w:rPr>
+          <w:rFonts w:ascii="Calibri" w:hAnsi="Calibri" w:cs="Calibri"/>
+        </w:rPr>
+      </w:pPr>
+      <w:r>
+        <w:rPr>
+          <w:rFonts w:ascii="Calibri" w:hAnsi="Calibri" w:cs="Calibri"/>
+        </w:rPr>
+        <w:t>population &lt;- c(500, 500)</w:t>
+      </w:r>
+    </w:p>
+    <w:p>
+      <w:pPr>
+        <w:rPr>
+          <w:rFonts w:ascii="Calibri" w:hAnsi="Calibri" w:cs="Calibri"/>
+        </w:rPr>
+      </w:pPr>
+      <w:r>
+        <w:rPr>
+          <w:rFonts w:ascii="Calibri" w:hAnsi="Calibri" w:cs="Calibri"/>
+        </w:rPr>
+        <w:t>risk &lt;- cases / population</w:t>
+      </w:r>
+    </w:p>
+    <w:p>
+      <w:pPr>
+        <w:rPr>
+          <w:rFonts w:ascii="Calibri" w:hAnsi="Calibri" w:cs="Calibri"/>
+        </w:rPr>
+      </w:pPr>
+    </w:p>
+    <w:p>
+      <w:pPr>
+        <w:rPr>
+          <w:rFonts w:ascii="Calibri" w:hAnsi="Calibri" w:cs="Calibri"/>
+        </w:rPr>
+      </w:pPr>
+      <w:proofErr w:type="spellStart"/>
+      <w:r>
+        <w:rPr>
+          <w:rFonts w:ascii="Calibri" w:hAnsi="Calibri" w:cs="Calibri"/>
+        </w:rPr>
+        <w:t>barplot</w:t>
+      </w:r>
+      <w:proofErr w:type="spellEnd"/>
+      <w:r>
+        <w:rPr>
+          <w:rFonts w:ascii="Calibri" w:hAnsi="Calibri" w:cs="Calibri"/>
+        </w:rPr>
+        <w:t>(</w:t>
+      </w:r>
+    </w:p>
+    <w:p>
+      <w:pPr>
+        <w:rPr>
+          <w:rFonts w:ascii="Calibri" w:hAnsi="Calibri" w:cs="Calibri"/>
+        </w:rPr>
+      </w:pPr>
+      <w:r>
+        <w:rPr>
+          <w:rFonts w:ascii="Calibri" w:hAnsi="Calibri" w:cs="Calibri"/>
+        </w:rPr>
+        <w:t>risk,</w:t>
+      </w:r>
+    </w:p>
+    <w:p>
+      <w:pPr>
+        <w:rPr>
+          <w:rFonts w:ascii="Calibri" w:hAnsi="Calibri" w:cs="Calibri"/>
+        </w:rPr>
+      </w:pPr>
+      <w:proofErr w:type="spellStart"/>
+      <w:r>
+        <w:rPr>
+          <w:rFonts w:ascii="Calibri" w:hAnsi="Calibri" w:cs="Calibri"/>
+        </w:rPr>
+        <w:t>names.arg</w:t>
+      </w:r>
+      <w:proofErr w:type="spellEnd"/>
+      <w:r>
+        <w:rPr>
+          <w:rFonts w:ascii="Calibri" w:hAnsi="Calibri" w:cs="Calibri"/>
+        </w:rPr>
+        <w:t xml:space="preserve"> = group,</w:t>
+      </w:r>
+    </w:p>
+    <w:p>
+      <w:pPr>
+        <w:rPr>
+          <w:rFonts w:ascii="Calibri" w:hAnsi="Calibri" w:cs="Calibri"/>
+        </w:rPr>
+      </w:pPr>
+      <w:r>
+        <w:rPr>
+          <w:rFonts w:ascii="Calibri" w:hAnsi="Calibri" w:cs="Calibri"/>
+        </w:rPr>
+        <w:t>col = c("</w:t>
+      </w:r>
+      <w:proofErr w:type="spellStart"/>
+      <w:r>
+        <w:rPr>
+          <w:rFonts w:ascii="Calibri" w:hAnsi="Calibri" w:cs="Calibri"/>
+        </w:rPr>
+        <w:t>steelblue</w:t>
+      </w:r>
+      <w:proofErr w:type="spellEnd"/>
+      <w:r>
+        <w:rPr>
+          <w:rFonts w:ascii="Calibri" w:hAnsi="Calibri" w:cs="Calibri"/>
+        </w:rPr>
+        <w:t>", "tomato"),</w:t>
+      </w:r>
+    </w:p>
+    <w:p>
+      <w:pPr>
+        <w:rPr>
+          <w:rFonts w:ascii="Calibri" w:hAnsi="Calibri" w:cs="Calibri"/>
+        </w:rPr>
+      </w:pPr>
+      <w:r>
+        <w:rPr>
+          <w:rFonts w:ascii="Calibri" w:hAnsi="Calibri" w:cs="Calibri"/>
+        </w:rPr>
         <w:lastRenderedPageBreak/>
-        <w:t>Panopto</w:t>
-      </w:r>
+        <w:t>main = "Risk of Infection by Vaccination Status"</w:t>
+      </w:r>
+    </w:p>
+    <w:p>
+      <w:pPr>
+        <w:rPr>
+          <w:rFonts w:ascii="Calibri" w:hAnsi="Calibri" w:cs="Calibri"/>
+        </w:rPr>
+      </w:pPr>
+      <w:r>
+        <w:rPr>
+          <w:rFonts w:ascii="Calibri" w:hAnsi="Calibri" w:cs="Calibri"/>
+        </w:rPr>
+        <w:t>)</w:t>
+      </w:r>
+    </w:p>
+    <w:p>
+      <w:pPr>
+        <w:rPr>
+          <w:rFonts w:ascii="Calibri" w:hAnsi="Calibri" w:cs="Calibri"/>
+        </w:rPr>
+      </w:pPr>
+    </w:p>
+    <w:p>
+      <w:pPr>
+        <w:rPr>
+          <w:rFonts w:ascii="Calibri" w:hAnsi="Calibri" w:cs="Calibri"/>
+        </w:rPr>
+      </w:pPr>
+      <w:r>
+        <w:rPr>
+          <w:rFonts w:ascii="Calibri" w:hAnsi="Calibri" w:cs="Calibri"/>
+        </w:rPr>
+        <w:t>END R Code</w:t>
+      </w:r>
+    </w:p>
+    <w:p>
+      <w:pPr>
+        <w:rPr>
+          <w:rFonts w:ascii="Calibri" w:hAnsi="Calibri" w:cs="Calibri"/>
+        </w:rPr>
+      </w:pPr>
+    </w:p>
+    <w:p>
+      <w:pPr>
+        <w:rPr>
+          <w:rFonts w:ascii="Calibri" w:hAnsi="Calibri" w:cs="Calibri"/>
+        </w:rPr>
+      </w:pPr>
+    </w:p>
+    <w:p>
+      <w:pPr>
+        <w:rPr>
+          <w:rFonts w:ascii="Calibri" w:hAnsi="Calibri" w:cs="Calibri"/>
+        </w:rPr>
+      </w:pPr>
+    </w:p>
+    <w:p>
+      <w:pPr>
+        <w:pStyle w:val="Heading2"/>
+        <w:rPr>
+          <w:rFonts w:ascii="Calibri" w:hAnsi="Calibri" w:cs="Calibri"/>
+        </w:rPr>
+      </w:pPr>
+      <w:r>
+        <w:rPr>
+          <w:rFonts w:ascii="Calibri" w:hAnsi="Calibri" w:cs="Calibri"/>
+        </w:rPr>
+        <w:t>R Output Only</w:t>
+      </w:r>
+    </w:p>
+    <w:p>
+      <w:pPr>
+        <w:rPr>
+          <w:rFonts w:ascii="Calibri" w:hAnsi="Calibri" w:cs="Calibri"/>
+        </w:rPr>
+      </w:pPr>
+    </w:p>
+    <w:p>
+      <w:pPr>
+        <w:rPr>
+          <w:rFonts w:ascii="Calibri" w:hAnsi="Calibri" w:cs="Calibri"/>
+        </w:rPr>
+      </w:pPr>
+      <w:r>
+        <w:rPr>
+          <w:rFonts w:ascii="Calibri" w:hAnsi="Calibri" w:cs="Calibri"/>
+        </w:rPr>
+        <w:t>R Code</w:t>
+      </w:r>
+    </w:p>
+    <w:p>
+      <w:pPr>
+        <w:rPr>
+          <w:rFonts w:ascii="Calibri" w:hAnsi="Calibri" w:cs="Calibri"/>
+        </w:rPr>
+      </w:pPr>
+      <w:r>
+        <w:rPr>
+          <w:rFonts w:ascii="Calibri" w:hAnsi="Calibri" w:cs="Calibri"/>
+        </w:rPr>
+        <w:t>R Mode :: static</w:t>
+      </w:r>
+    </w:p>
+    <w:p>
+      <w:pPr>
+        <w:rPr>
+          <w:rFonts w:ascii="Calibri" w:hAnsi="Calibri" w:cs="Calibri"/>
+        </w:rPr>
+      </w:pPr>
+      <w:r>
+        <w:rPr>
+          <w:rFonts w:ascii="Calibri" w:hAnsi="Calibri" w:cs="Calibri"/>
+        </w:rPr>
+        <w:t>Echo :: false</w:t>
+      </w:r>
+    </w:p>
+    <w:p>
+      <w:pPr>
+        <w:rPr>
+          <w:rFonts w:ascii="Calibri" w:hAnsi="Calibri" w:cs="Calibri"/>
+        </w:rPr>
+      </w:pPr>
+      <w:r>
+        <w:rPr>
+          <w:rFonts w:ascii="Calibri" w:hAnsi="Calibri" w:cs="Calibri"/>
+        </w:rPr>
+        <w:t>Output :: true</w:t>
+      </w:r>
+    </w:p>
+    <w:p>
+      <w:pPr>
+        <w:rPr>
+          <w:rFonts w:ascii="Calibri" w:hAnsi="Calibri" w:cs="Calibri"/>
+        </w:rPr>
+      </w:pPr>
+      <w:r>
+        <w:rPr>
+          <w:rFonts w:ascii="Calibri" w:hAnsi="Calibri" w:cs="Calibri"/>
+        </w:rPr>
+        <w:t>Alt :: Bar chart comparing infection risk between vaccinated and unvaccinated groups.</w:t>
+      </w:r>
+    </w:p>
+    <w:p>
+      <w:pPr>
+        <w:rPr>
+          <w:rFonts w:ascii="Calibri" w:hAnsi="Calibri" w:cs="Calibri"/>
+        </w:rPr>
+      </w:pPr>
+      <w:r>
+        <w:rPr>
+          <w:rFonts w:ascii="Calibri" w:hAnsi="Calibri" w:cs="Calibri"/>
+        </w:rPr>
+        <w:t>Caption :: Risk of infection by vaccination status</w:t>
+      </w:r>
+    </w:p>
+    <w:p>
+      <w:pPr>
+        <w:rPr>
+          <w:rFonts w:ascii="Calibri" w:hAnsi="Calibri" w:cs="Calibri"/>
+        </w:rPr>
+      </w:pPr>
+    </w:p>
+    <w:p>
+      <w:pPr>
+        <w:rPr>
+          <w:rFonts w:ascii="Calibri" w:hAnsi="Calibri" w:cs="Calibri"/>
+        </w:rPr>
+      </w:pPr>
+      <w:r>
+        <w:rPr>
+          <w:rFonts w:ascii="Calibri" w:hAnsi="Calibri" w:cs="Calibri"/>
+        </w:rPr>
+        <w:t>group &lt;- c("Vaccinated", "Unvaccinated")</w:t>
+      </w:r>
+    </w:p>
+    <w:p>
+      <w:pPr>
+        <w:rPr>
+          <w:rFonts w:ascii="Calibri" w:hAnsi="Calibri" w:cs="Calibri"/>
+        </w:rPr>
+      </w:pPr>
+      <w:r>
+        <w:rPr>
+          <w:rFonts w:ascii="Calibri" w:hAnsi="Calibri" w:cs="Calibri"/>
+        </w:rPr>
+        <w:t>cases &lt;- c(5, 25)</w:t>
+      </w:r>
+    </w:p>
+    <w:p>
+      <w:pPr>
+        <w:rPr>
+          <w:rFonts w:ascii="Calibri" w:hAnsi="Calibri" w:cs="Calibri"/>
+        </w:rPr>
+      </w:pPr>
+      <w:r>
+        <w:rPr>
+          <w:rFonts w:ascii="Calibri" w:hAnsi="Calibri" w:cs="Calibri"/>
+        </w:rPr>
+        <w:t>population &lt;- c(500, 500)</w:t>
+      </w:r>
+    </w:p>
+    <w:p>
+      <w:pPr>
+        <w:rPr>
+          <w:rFonts w:ascii="Calibri" w:hAnsi="Calibri" w:cs="Calibri"/>
+        </w:rPr>
+      </w:pPr>
+      <w:r>
+        <w:rPr>
+          <w:rFonts w:ascii="Calibri" w:hAnsi="Calibri" w:cs="Calibri"/>
+        </w:rPr>
+        <w:t>risk &lt;- cases / population</w:t>
+      </w:r>
+    </w:p>
+    <w:p>
+      <w:pPr>
+        <w:rPr>
+          <w:rFonts w:ascii="Calibri" w:hAnsi="Calibri" w:cs="Calibri"/>
+        </w:rPr>
+      </w:pPr>
     </w:p>
     <w:p>
       <w:pPr>
@@ -1116,36 +1852,147 @@
         </w:rPr>
       </w:pPr>
       <w:proofErr w:type="spellStart"/>
-      <w:proofErr w:type="gramStart"/>
-      <w:r>
-        <w:rPr>
-          <w:rFonts w:ascii="Calibri" w:hAnsi="Calibri" w:cs="Calibri"/>
-        </w:rPr>
-        <w:t>PanoptoEmbed</w:t>
+      <w:r>
+        <w:rPr>
+          <w:rFonts w:ascii="Calibri" w:hAnsi="Calibri" w:cs="Calibri"/>
+        </w:rPr>
+        <w:t>barplot</w:t>
       </w:r>
       <w:proofErr w:type="spellEnd"/>
       <w:r>
         <w:rPr>
           <w:rFonts w:ascii="Calibri" w:hAnsi="Calibri" w:cs="Calibri"/>
         </w:rPr>
-        <w:t xml:space="preserve"> :</w:t>
-      </w:r>
-      <w:proofErr w:type="gramEnd"/>
-      <w:r>
-        <w:rPr>
-          <w:rFonts w:ascii="Calibri" w:hAnsi="Calibri" w:cs="Calibri"/>
-        </w:rPr>
-        <w:t>:</w:t>
-      </w:r>
-      <w:r>
-        <w:t xml:space="preserve"> </w:t>
-      </w:r>
-      <w:r>
-        <w:rPr>
-          <w:rFonts w:ascii="Calibri" w:hAnsi="Calibri" w:cs="Calibri"/>
-        </w:rPr>
-        <w:t>https://lshtm.cloud.panopto.eu/Panopto/Pages/Viewer.aspx?id=d19ba573-9ad1-480b-95db-b3ed01014aab</w:t>
-      </w:r>
+        <w:t>(</w:t>
+      </w:r>
+    </w:p>
+    <w:p>
+      <w:pPr>
+        <w:rPr>
+          <w:rFonts w:ascii="Calibri" w:hAnsi="Calibri" w:cs="Calibri"/>
+        </w:rPr>
+      </w:pPr>
+      <w:r>
+        <w:rPr>
+          <w:rFonts w:ascii="Calibri" w:hAnsi="Calibri" w:cs="Calibri"/>
+        </w:rPr>
+        <w:t>risk,</w:t>
+      </w:r>
+    </w:p>
+    <w:p>
+      <w:pPr>
+        <w:rPr>
+          <w:rFonts w:ascii="Calibri" w:hAnsi="Calibri" w:cs="Calibri"/>
+        </w:rPr>
+      </w:pPr>
+      <w:proofErr w:type="spellStart"/>
+      <w:r>
+        <w:rPr>
+          <w:rFonts w:ascii="Calibri" w:hAnsi="Calibri" w:cs="Calibri"/>
+        </w:rPr>
+        <w:t>names.arg</w:t>
+      </w:r>
+      <w:proofErr w:type="spellEnd"/>
+      <w:r>
+        <w:rPr>
+          <w:rFonts w:ascii="Calibri" w:hAnsi="Calibri" w:cs="Calibri"/>
+        </w:rPr>
+        <w:t xml:space="preserve"> = group,</w:t>
+      </w:r>
+    </w:p>
+    <w:p>
+      <w:pPr>
+        <w:rPr>
+          <w:rFonts w:ascii="Calibri" w:hAnsi="Calibri" w:cs="Calibri"/>
+        </w:rPr>
+      </w:pPr>
+      <w:r>
+        <w:rPr>
+          <w:rFonts w:ascii="Calibri" w:hAnsi="Calibri" w:cs="Calibri"/>
+        </w:rPr>
+        <w:t>col = c("</w:t>
+      </w:r>
+      <w:proofErr w:type="spellStart"/>
+      <w:r>
+        <w:rPr>
+          <w:rFonts w:ascii="Calibri" w:hAnsi="Calibri" w:cs="Calibri"/>
+        </w:rPr>
+        <w:t>steelblue</w:t>
+      </w:r>
+      <w:proofErr w:type="spellEnd"/>
+      <w:r>
+        <w:rPr>
+          <w:rFonts w:ascii="Calibri" w:hAnsi="Calibri" w:cs="Calibri"/>
+        </w:rPr>
+        <w:t>", "tomato"),</w:t>
+      </w:r>
+    </w:p>
+    <w:p>
+      <w:pPr>
+        <w:rPr>
+          <w:rFonts w:ascii="Calibri" w:hAnsi="Calibri" w:cs="Calibri"/>
+        </w:rPr>
+      </w:pPr>
+      <w:r>
+        <w:rPr>
+          <w:rFonts w:ascii="Calibri" w:hAnsi="Calibri" w:cs="Calibri"/>
+        </w:rPr>
+        <w:t>main = "Risk of Infection by Vaccination Status"</w:t>
+      </w:r>
+    </w:p>
+    <w:p>
+      <w:pPr>
+        <w:rPr>
+          <w:rFonts w:ascii="Calibri" w:hAnsi="Calibri" w:cs="Calibri"/>
+        </w:rPr>
+      </w:pPr>
+      <w:r>
+        <w:rPr>
+          <w:rFonts w:ascii="Calibri" w:hAnsi="Calibri" w:cs="Calibri"/>
+        </w:rPr>
+        <w:t>)</w:t>
+      </w:r>
+    </w:p>
+    <w:p>
+      <w:pPr>
+        <w:rPr>
+          <w:rFonts w:ascii="Calibri" w:hAnsi="Calibri" w:cs="Calibri"/>
+        </w:rPr>
+      </w:pPr>
+    </w:p>
+    <w:p>
+      <w:pPr>
+        <w:rPr>
+          <w:rFonts w:ascii="Calibri" w:hAnsi="Calibri" w:cs="Calibri"/>
+        </w:rPr>
+      </w:pPr>
+      <w:r>
+        <w:rPr>
+          <w:rFonts w:ascii="Calibri" w:hAnsi="Calibri" w:cs="Calibri"/>
+        </w:rPr>
+        <w:t>END R Code</w:t>
+      </w:r>
+    </w:p>
+    <w:p>
+      <w:pPr>
+        <w:rPr>
+          <w:rFonts w:ascii="Calibri" w:hAnsi="Calibri" w:cs="Calibri"/>
+        </w:rPr>
+      </w:pPr>
+    </w:p>
+    <w:p>
+      <w:pPr>
+        <w:rPr>
+          <w:rFonts w:ascii="Calibri" w:hAnsi="Calibri" w:cs="Calibri"/>
+        </w:rPr>
+      </w:pPr>
+    </w:p>
+    <w:p>
+      <w:pPr>
+        <w:rPr>
+          <w:rFonts w:ascii="Calibri" w:hAnsi="Calibri" w:cs="Calibri"/>
+        </w:rPr>
+      </w:pPr>
     </w:p>
     <w:p>
       <w:pPr>
@@ -1158,7 +2005,7 @@
         <w:rPr>
           <w:rFonts w:ascii="Calibri" w:hAnsi="Calibri" w:cs="Calibri"/>
         </w:rPr>
-        <w:t>Visualising the Results</w:t>
+        <w:t>Interactive R Code</w:t>
       </w:r>
     </w:p>
     <w:p>
@@ -1187,155 +2034,132 @@
           <w:rFonts w:ascii="Calibri" w:hAnsi="Calibri" w:cs="Calibri"/>
         </w:rPr>
       </w:pPr>
-      <w:proofErr w:type="gramStart"/>
-      <w:r>
-        <w:rPr>
-          <w:rFonts w:ascii="Calibri" w:hAnsi="Calibri" w:cs="Calibri"/>
-        </w:rPr>
-        <w:t>Alt :</w:t>
-      </w:r>
-      <w:proofErr w:type="gramEnd"/>
-      <w:r>
-        <w:rPr>
-          <w:rFonts w:ascii="Calibri" w:hAnsi="Calibri" w:cs="Calibri"/>
-        </w:rPr>
-        <w:t>: Bar chart showing risk of infection for vaccinated and unvaccinated groups.</w:t>
-      </w:r>
-    </w:p>
-    <w:p>
-      <w:pPr>
-        <w:rPr>
-          <w:rFonts w:ascii="Calibri" w:hAnsi="Calibri" w:cs="Calibri"/>
-        </w:rPr>
-      </w:pPr>
-      <w:proofErr w:type="gramStart"/>
-      <w:r>
-        <w:rPr>
-          <w:rFonts w:ascii="Calibri" w:hAnsi="Calibri" w:cs="Calibri"/>
-        </w:rPr>
-        <w:t>Caption :</w:t>
-      </w:r>
-      <w:proofErr w:type="gramEnd"/>
-      <w:r>
-        <w:rPr>
-          <w:rFonts w:ascii="Calibri" w:hAnsi="Calibri" w:cs="Calibri"/>
-        </w:rPr>
-        <w:t>: Risk of Infection by Vaccination Status</w:t>
-      </w:r>
-    </w:p>
-    <w:p>
-      <w:pPr>
-        <w:rPr>
-          <w:rFonts w:ascii="Calibri" w:hAnsi="Calibri" w:cs="Calibri"/>
-        </w:rPr>
-      </w:pPr>
-    </w:p>
-    <w:p>
-      <w:pPr>
-        <w:rPr>
-          <w:rFonts w:ascii="Calibri" w:hAnsi="Calibri" w:cs="Calibri"/>
-        </w:rPr>
-      </w:pPr>
-      <w:r>
-        <w:rPr>
-          <w:rFonts w:ascii="Calibri" w:hAnsi="Calibri" w:cs="Calibri"/>
-        </w:rPr>
-        <w:t xml:space="preserve">group &lt;- </w:t>
-      </w:r>
-      <w:proofErr w:type="gramStart"/>
-      <w:r>
-        <w:rPr>
-          <w:rFonts w:ascii="Calibri" w:hAnsi="Calibri" w:cs="Calibri"/>
-        </w:rPr>
-        <w:t>c(</w:t>
-      </w:r>
-      <w:proofErr w:type="gramEnd"/>
-      <w:r>
-        <w:rPr>
-          <w:rFonts w:ascii="Calibri" w:hAnsi="Calibri" w:cs="Calibri"/>
-        </w:rPr>
-        <w:t>"Vaccinated", "Unvaccinated")</w:t>
-      </w:r>
-    </w:p>
-    <w:p>
-      <w:pPr>
-        <w:rPr>
-          <w:rFonts w:ascii="Calibri" w:hAnsi="Calibri" w:cs="Calibri"/>
-        </w:rPr>
-      </w:pPr>
-      <w:r>
-        <w:rPr>
-          <w:rFonts w:ascii="Calibri" w:hAnsi="Calibri" w:cs="Calibri"/>
-        </w:rPr>
-        <w:t xml:space="preserve">cases &lt;- </w:t>
-      </w:r>
-      <w:proofErr w:type="gramStart"/>
-      <w:r>
-        <w:rPr>
-          <w:rFonts w:ascii="Calibri" w:hAnsi="Calibri" w:cs="Calibri"/>
-        </w:rPr>
-        <w:t>c(</w:t>
-      </w:r>
-      <w:proofErr w:type="gramEnd"/>
-      <w:r>
-        <w:rPr>
-          <w:rFonts w:ascii="Calibri" w:hAnsi="Calibri" w:cs="Calibri"/>
-        </w:rPr>
-        <w:t>5, 25)</w:t>
-      </w:r>
-    </w:p>
-    <w:p>
-      <w:pPr>
-        <w:rPr>
-          <w:rFonts w:ascii="Calibri" w:hAnsi="Calibri" w:cs="Calibri"/>
-        </w:rPr>
-      </w:pPr>
-      <w:r>
-        <w:rPr>
-          <w:rFonts w:ascii="Calibri" w:hAnsi="Calibri" w:cs="Calibri"/>
-        </w:rPr>
-        <w:t xml:space="preserve">population &lt;- </w:t>
-      </w:r>
-      <w:proofErr w:type="gramStart"/>
-      <w:r>
-        <w:rPr>
-          <w:rFonts w:ascii="Calibri" w:hAnsi="Calibri" w:cs="Calibri"/>
-        </w:rPr>
-        <w:t>c(</w:t>
-      </w:r>
-      <w:proofErr w:type="gramEnd"/>
-      <w:r>
-        <w:rPr>
-          <w:rFonts w:ascii="Calibri" w:hAnsi="Calibri" w:cs="Calibri"/>
-        </w:rPr>
-        <w:t>500, 500)</w:t>
-      </w:r>
-    </w:p>
-    <w:p>
-      <w:pPr>
-        <w:rPr>
-          <w:rFonts w:ascii="Calibri" w:hAnsi="Calibri" w:cs="Calibri"/>
-        </w:rPr>
-      </w:pPr>
-      <w:r>
-        <w:rPr>
-          <w:rFonts w:ascii="Calibri" w:hAnsi="Calibri" w:cs="Calibri"/>
-        </w:rPr>
-        <w:t>risk &lt;- cases / population</w:t>
-      </w:r>
-    </w:p>
-    <w:p>
-      <w:pPr>
-        <w:rPr>
-          <w:rFonts w:ascii="Calibri" w:hAnsi="Calibri" w:cs="Calibri"/>
-        </w:rPr>
-      </w:pPr>
+      <w:r>
+        <w:rPr>
+          <w:rFonts w:ascii="Calibri" w:hAnsi="Calibri" w:cs="Calibri"/>
+        </w:rPr>
+        <w:t xml:space="preserve">R Mode :: </w:t>
+      </w:r>
       <w:proofErr w:type="spellStart"/>
-      <w:proofErr w:type="gramStart"/>
-      <w:r>
-        <w:rPr>
-          <w:rFonts w:ascii="Calibri" w:hAnsi="Calibri" w:cs="Calibri"/>
-        </w:rPr>
+      <w:r>
+        <w:rPr>
+          <w:rFonts w:ascii="Calibri" w:hAnsi="Calibri" w:cs="Calibri"/>
+        </w:rPr>
+        <w:t>webr</w:t>
+      </w:r>
+      <w:proofErr w:type="spellEnd"/>
+    </w:p>
+    <w:p>
+      <w:pPr>
+        <w:rPr>
+          <w:rFonts w:ascii="Calibri" w:hAnsi="Calibri" w:cs="Calibri"/>
+        </w:rPr>
+      </w:pPr>
+      <w:r>
+        <w:rPr>
+          <w:rFonts w:ascii="Calibri" w:hAnsi="Calibri" w:cs="Calibri"/>
+        </w:rPr>
+        <w:t>Echo :: true</w:t>
+      </w:r>
+    </w:p>
+    <w:p>
+      <w:pPr>
+        <w:rPr>
+          <w:rFonts w:ascii="Calibri" w:hAnsi="Calibri" w:cs="Calibri"/>
+        </w:rPr>
+      </w:pPr>
+      <w:r>
+        <w:rPr>
+          <w:rFonts w:ascii="Calibri" w:hAnsi="Calibri" w:cs="Calibri"/>
+        </w:rPr>
+        <w:t>Output :: true</w:t>
+      </w:r>
+    </w:p>
+    <w:p>
+      <w:pPr>
+        <w:rPr>
+          <w:rFonts w:ascii="Calibri" w:hAnsi="Calibri" w:cs="Calibri"/>
+        </w:rPr>
+      </w:pPr>
+      <w:r>
+        <w:rPr>
+          <w:rFonts w:ascii="Calibri" w:hAnsi="Calibri" w:cs="Calibri"/>
+        </w:rPr>
+        <w:t>Alt :: Epidemic curve showing daily outbreak case counts.</w:t>
+      </w:r>
+    </w:p>
+    <w:p>
+      <w:pPr>
+        <w:rPr>
+          <w:rFonts w:ascii="Calibri" w:hAnsi="Calibri" w:cs="Calibri"/>
+        </w:rPr>
+      </w:pPr>
+      <w:r>
+        <w:rPr>
+          <w:rFonts w:ascii="Calibri" w:hAnsi="Calibri" w:cs="Calibri"/>
+        </w:rPr>
+        <w:t>Caption :: Simulated Epidemic Curve</w:t>
+      </w:r>
+    </w:p>
+    <w:p>
+      <w:pPr>
+        <w:rPr>
+          <w:rFonts w:ascii="Calibri" w:hAnsi="Calibri" w:cs="Calibri"/>
+        </w:rPr>
+      </w:pPr>
+    </w:p>
+    <w:p>
+      <w:pPr>
+        <w:rPr>
+          <w:rFonts w:ascii="Calibri" w:hAnsi="Calibri" w:cs="Calibri"/>
+        </w:rPr>
+      </w:pPr>
+      <w:r>
+        <w:rPr>
+          <w:rFonts w:ascii="Calibri" w:hAnsi="Calibri" w:cs="Calibri"/>
+        </w:rPr>
+        <w:t>days &lt;- 1:10</w:t>
+      </w:r>
+    </w:p>
+    <w:p>
+      <w:pPr>
+        <w:rPr>
+          <w:rFonts w:ascii="Calibri" w:hAnsi="Calibri" w:cs="Calibri"/>
+        </w:rPr>
+      </w:pPr>
+    </w:p>
+    <w:p>
+      <w:pPr>
+        <w:rPr>
+          <w:rFonts w:ascii="Calibri" w:hAnsi="Calibri" w:cs="Calibri"/>
+        </w:rPr>
+      </w:pPr>
+      <w:r>
+        <w:rPr>
+          <w:rFonts w:ascii="Calibri" w:hAnsi="Calibri" w:cs="Calibri"/>
+        </w:rPr>
+        <w:t>cases &lt;- c(2, 4, 7, 12, 18, 15, 11, 7, 4, 2)</w:t>
+      </w:r>
+    </w:p>
+    <w:p>
+      <w:pPr>
+        <w:rPr>
+          <w:rFonts w:ascii="Calibri" w:hAnsi="Calibri" w:cs="Calibri"/>
+        </w:rPr>
+      </w:pPr>
+    </w:p>
+    <w:p>
+      <w:pPr>
+        <w:rPr>
+          <w:rFonts w:ascii="Calibri" w:hAnsi="Calibri" w:cs="Calibri"/>
+        </w:rPr>
+      </w:pPr>
+      <w:proofErr w:type="spellStart"/>
+      <w:r>
+        <w:rPr>
+          <w:rFonts w:ascii="Calibri" w:hAnsi="Calibri" w:cs="Calibri"/>
+        </w:rPr>
+        <w:lastRenderedPageBreak/>
         <w:t>barplot</w:t>
       </w:r>
       <w:proofErr w:type="spellEnd"/>
@@ -1345,13 +2169,26 @@
         </w:rPr>
         <w:t>(</w:t>
       </w:r>
-      <w:proofErr w:type="gramEnd"/>
-      <w:r>
-        <w:rPr>
-          <w:rFonts w:ascii="Calibri" w:hAnsi="Calibri" w:cs="Calibri"/>
-        </w:rPr>
-        <w:t xml:space="preserve">risk, </w:t>
-      </w:r>
+    </w:p>
+    <w:p>
+      <w:pPr>
+        <w:rPr>
+          <w:rFonts w:ascii="Calibri" w:hAnsi="Calibri" w:cs="Calibri"/>
+        </w:rPr>
+      </w:pPr>
+      <w:r>
+        <w:rPr>
+          <w:rFonts w:ascii="Calibri" w:hAnsi="Calibri" w:cs="Calibri"/>
+        </w:rPr>
+        <w:t>cases,</w:t>
+      </w:r>
+    </w:p>
+    <w:p>
+      <w:pPr>
+        <w:rPr>
+          <w:rFonts w:ascii="Calibri" w:hAnsi="Calibri" w:cs="Calibri"/>
+        </w:rPr>
+      </w:pPr>
       <w:proofErr w:type="spellStart"/>
       <w:r>
         <w:rPr>
@@ -1364,7 +2201,20 @@
         <w:rPr>
           <w:rFonts w:ascii="Calibri" w:hAnsi="Calibri" w:cs="Calibri"/>
         </w:rPr>
-        <w:t xml:space="preserve"> = group, col = c("</w:t>
+        <w:t xml:space="preserve"> = days,</w:t>
+      </w:r>
+    </w:p>
+    <w:p>
+      <w:pPr>
+        <w:rPr>
+          <w:rFonts w:ascii="Calibri" w:hAnsi="Calibri" w:cs="Calibri"/>
+        </w:rPr>
+      </w:pPr>
+      <w:r>
+        <w:rPr>
+          <w:rFonts w:ascii="Calibri" w:hAnsi="Calibri" w:cs="Calibri"/>
+        </w:rPr>
+        <w:t>col = "</w:t>
       </w:r>
       <w:proofErr w:type="spellStart"/>
       <w:r>
@@ -1378,20 +2228,75 @@
         <w:rPr>
           <w:rFonts w:ascii="Calibri" w:hAnsi="Calibri" w:cs="Calibri"/>
         </w:rPr>
-        <w:t>", "tomato"),</w:t>
-      </w:r>
-    </w:p>
-    <w:p>
-      <w:pPr>
-        <w:rPr>
-          <w:rFonts w:ascii="Calibri" w:hAnsi="Calibri" w:cs="Calibri"/>
-        </w:rPr>
-      </w:pPr>
-      <w:r>
-        <w:rPr>
-          <w:rFonts w:ascii="Calibri" w:hAnsi="Calibri" w:cs="Calibri"/>
-        </w:rPr>
-        <w:t>main = "Risk of Infection by Vaccination Status")</w:t>
+        <w:t>",</w:t>
+      </w:r>
+    </w:p>
+    <w:p>
+      <w:pPr>
+        <w:rPr>
+          <w:rFonts w:ascii="Calibri" w:hAnsi="Calibri" w:cs="Calibri"/>
+        </w:rPr>
+      </w:pPr>
+      <w:proofErr w:type="spellStart"/>
+      <w:r>
+        <w:rPr>
+          <w:rFonts w:ascii="Calibri" w:hAnsi="Calibri" w:cs="Calibri"/>
+        </w:rPr>
+        <w:t>xlab</w:t>
+      </w:r>
+      <w:proofErr w:type="spellEnd"/>
+      <w:r>
+        <w:rPr>
+          <w:rFonts w:ascii="Calibri" w:hAnsi="Calibri" w:cs="Calibri"/>
+        </w:rPr>
+        <w:t xml:space="preserve"> = "Day",</w:t>
+      </w:r>
+    </w:p>
+    <w:p>
+      <w:pPr>
+        <w:rPr>
+          <w:rFonts w:ascii="Calibri" w:hAnsi="Calibri" w:cs="Calibri"/>
+        </w:rPr>
+      </w:pPr>
+      <w:proofErr w:type="spellStart"/>
+      <w:r>
+        <w:rPr>
+          <w:rFonts w:ascii="Calibri" w:hAnsi="Calibri" w:cs="Calibri"/>
+        </w:rPr>
+        <w:t>ylab</w:t>
+      </w:r>
+      <w:proofErr w:type="spellEnd"/>
+      <w:r>
+        <w:rPr>
+          <w:rFonts w:ascii="Calibri" w:hAnsi="Calibri" w:cs="Calibri"/>
+        </w:rPr>
+        <w:t xml:space="preserve"> = "Number of Cases",</w:t>
+      </w:r>
+    </w:p>
+    <w:p>
+      <w:pPr>
+        <w:rPr>
+          <w:rFonts w:ascii="Calibri" w:hAnsi="Calibri" w:cs="Calibri"/>
+        </w:rPr>
+      </w:pPr>
+      <w:r>
+        <w:rPr>
+          <w:rFonts w:ascii="Calibri" w:hAnsi="Calibri" w:cs="Calibri"/>
+        </w:rPr>
+        <w:t>main = "Simulated Epidemic Curve"</w:t>
+      </w:r>
+    </w:p>
+    <w:p>
+      <w:pPr>
+        <w:rPr>
+          <w:rFonts w:ascii="Calibri" w:hAnsi="Calibri" w:cs="Calibri"/>
+        </w:rPr>
+      </w:pPr>
+      <w:r>
+        <w:rPr>
+          <w:rFonts w:ascii="Calibri" w:hAnsi="Calibri" w:cs="Calibri"/>
+        </w:rPr>
+        <w:t>)</w:t>
       </w:r>
     </w:p>
     <w:p>
@@ -1423,206 +2328,328 @@
     </w:p>
     <w:p>
       <w:pPr>
+        <w:rPr>
+          <w:rFonts w:ascii="Calibri" w:hAnsi="Calibri" w:cs="Calibri"/>
+        </w:rPr>
+      </w:pPr>
+    </w:p>
+    <w:p>
+      <w:pPr>
         <w:pStyle w:val="Heading2"/>
-      </w:pPr>
-      <w:r>
-        <w:t>R Code Only</w:t>
-      </w:r>
-    </w:p>
-    <w:p>
-      <w:pPr>
-        <w:rPr>
-          <w:rFonts w:ascii="Calibri" w:hAnsi="Calibri" w:cs="Calibri"/>
-        </w:rPr>
-      </w:pPr>
-      <w:r>
-        <w:rPr>
-          <w:rFonts w:ascii="Calibri" w:hAnsi="Calibri" w:cs="Calibri"/>
-        </w:rPr>
-        <w:t>R Example</w:t>
-      </w:r>
-    </w:p>
-    <w:p>
-      <w:pPr>
-        <w:rPr>
-          <w:rFonts w:ascii="Calibri" w:hAnsi="Calibri" w:cs="Calibri"/>
-        </w:rPr>
-      </w:pPr>
-      <w:r>
-        <w:rPr>
-          <w:rFonts w:ascii="Calibri" w:hAnsi="Calibri" w:cs="Calibri"/>
-        </w:rPr>
-        <w:t xml:space="preserve">group &lt;- </w:t>
-      </w:r>
-      <w:proofErr w:type="gramStart"/>
-      <w:r>
-        <w:rPr>
-          <w:rFonts w:ascii="Calibri" w:hAnsi="Calibri" w:cs="Calibri"/>
-        </w:rPr>
-        <w:t>c(</w:t>
-      </w:r>
-      <w:proofErr w:type="gramEnd"/>
-      <w:r>
-        <w:rPr>
-          <w:rFonts w:ascii="Calibri" w:hAnsi="Calibri" w:cs="Calibri"/>
-        </w:rPr>
-        <w:t>"Vaccinated", "Unvaccinated")</w:t>
+        <w:rPr>
+          <w:rFonts w:ascii="Calibri" w:hAnsi="Calibri" w:cs="Calibri"/>
+        </w:rPr>
+      </w:pPr>
+      <w:r>
+        <w:rPr>
+          <w:rFonts w:ascii="Calibri" w:hAnsi="Calibri" w:cs="Calibri"/>
+        </w:rPr>
+        <w:t>R Code Table example</w:t>
+      </w:r>
+    </w:p>
+    <w:p>
+      <w:pPr>
+        <w:rPr>
+          <w:rFonts w:ascii="Calibri" w:hAnsi="Calibri" w:cs="Calibri"/>
+        </w:rPr>
+      </w:pPr>
+    </w:p>
+    <w:p>
+      <w:pPr>
+        <w:rPr>
+          <w:rFonts w:ascii="Calibri" w:hAnsi="Calibri" w:cs="Calibri"/>
+        </w:rPr>
+      </w:pPr>
+    </w:p>
+    <w:p>
+      <w:pPr>
+        <w:rPr>
+          <w:rFonts w:ascii="Calibri" w:hAnsi="Calibri" w:cs="Calibri"/>
+        </w:rPr>
+      </w:pPr>
+      <w:r>
+        <w:rPr>
+          <w:rFonts w:ascii="Calibri" w:hAnsi="Calibri" w:cs="Calibri"/>
+        </w:rPr>
+        <w:t>R Code</w:t>
+      </w:r>
+    </w:p>
+    <w:p>
+      <w:pPr>
+        <w:rPr>
+          <w:rFonts w:ascii="Calibri" w:hAnsi="Calibri" w:cs="Calibri"/>
+        </w:rPr>
+      </w:pPr>
+      <w:r>
+        <w:rPr>
+          <w:rFonts w:ascii="Calibri" w:hAnsi="Calibri" w:cs="Calibri"/>
+        </w:rPr>
+        <w:t xml:space="preserve">R Mode :: </w:t>
+      </w:r>
+      <w:proofErr w:type="spellStart"/>
+      <w:r>
+        <w:rPr>
+          <w:rFonts w:ascii="Calibri" w:hAnsi="Calibri" w:cs="Calibri"/>
+        </w:rPr>
+        <w:t>webr</w:t>
+      </w:r>
+      <w:proofErr w:type="spellEnd"/>
+    </w:p>
+    <w:p>
+      <w:pPr>
+        <w:rPr>
+          <w:rFonts w:ascii="Calibri" w:hAnsi="Calibri" w:cs="Calibri"/>
+        </w:rPr>
+      </w:pPr>
+      <w:r>
+        <w:rPr>
+          <w:rFonts w:ascii="Calibri" w:hAnsi="Calibri" w:cs="Calibri"/>
+        </w:rPr>
+        <w:t>Echo :: true</w:t>
+      </w:r>
+    </w:p>
+    <w:p>
+      <w:pPr>
+        <w:rPr>
+          <w:rFonts w:ascii="Calibri" w:hAnsi="Calibri" w:cs="Calibri"/>
+        </w:rPr>
+      </w:pPr>
+      <w:r>
+        <w:rPr>
+          <w:rFonts w:ascii="Calibri" w:hAnsi="Calibri" w:cs="Calibri"/>
+        </w:rPr>
+        <w:t>Output :: true</w:t>
+      </w:r>
+    </w:p>
+    <w:p>
+      <w:pPr>
+        <w:rPr>
+          <w:rFonts w:ascii="Calibri" w:hAnsi="Calibri" w:cs="Calibri"/>
+        </w:rPr>
+      </w:pPr>
+    </w:p>
+    <w:p>
+      <w:pPr>
+        <w:rPr>
+          <w:rFonts w:ascii="Calibri" w:hAnsi="Calibri" w:cs="Calibri"/>
+        </w:rPr>
+      </w:pPr>
+      <w:r>
+        <w:rPr>
+          <w:rFonts w:ascii="Calibri" w:hAnsi="Calibri" w:cs="Calibri"/>
+        </w:rPr>
+        <w:t xml:space="preserve">data &lt;- </w:t>
+      </w:r>
+      <w:proofErr w:type="spellStart"/>
+      <w:r>
+        <w:rPr>
+          <w:rFonts w:ascii="Calibri" w:hAnsi="Calibri" w:cs="Calibri"/>
+        </w:rPr>
+        <w:t>data.frame</w:t>
+      </w:r>
+      <w:proofErr w:type="spellEnd"/>
+      <w:r>
+        <w:rPr>
+          <w:rFonts w:ascii="Calibri" w:hAnsi="Calibri" w:cs="Calibri"/>
+        </w:rPr>
+        <w:t>(</w:t>
+      </w:r>
+    </w:p>
+    <w:p>
+      <w:pPr>
+        <w:rPr>
+          <w:rFonts w:ascii="Calibri" w:hAnsi="Calibri" w:cs="Calibri"/>
+        </w:rPr>
+      </w:pPr>
+      <w:r>
+        <w:rPr>
+          <w:rFonts w:ascii="Calibri" w:hAnsi="Calibri" w:cs="Calibri"/>
+        </w:rPr>
+        <w:t>Group = c("Vaccinated", "Unvaccinated"),</w:t>
+      </w:r>
+    </w:p>
+    <w:p>
+      <w:pPr>
+        <w:rPr>
+          <w:rFonts w:ascii="Calibri" w:hAnsi="Calibri" w:cs="Calibri"/>
+        </w:rPr>
+      </w:pPr>
+      <w:r>
+        <w:rPr>
+          <w:rFonts w:ascii="Calibri" w:hAnsi="Calibri" w:cs="Calibri"/>
+        </w:rPr>
+        <w:t>Cases = c(5, 25),</w:t>
+      </w:r>
+    </w:p>
+    <w:p>
+      <w:pPr>
+        <w:rPr>
+          <w:rFonts w:ascii="Calibri" w:hAnsi="Calibri" w:cs="Calibri"/>
+        </w:rPr>
+      </w:pPr>
+      <w:r>
+        <w:rPr>
+          <w:rFonts w:ascii="Calibri" w:hAnsi="Calibri" w:cs="Calibri"/>
+        </w:rPr>
+        <w:t>Population = c(500, 500)</w:t>
+      </w:r>
+    </w:p>
+    <w:p>
+      <w:pPr>
+        <w:rPr>
+          <w:rFonts w:ascii="Calibri" w:hAnsi="Calibri" w:cs="Calibri"/>
+        </w:rPr>
+      </w:pPr>
+      <w:r>
+        <w:rPr>
+          <w:rFonts w:ascii="Calibri" w:hAnsi="Calibri" w:cs="Calibri"/>
+        </w:rPr>
+        <w:t>)</w:t>
+      </w:r>
+    </w:p>
+    <w:p>
+      <w:pPr>
+        <w:rPr>
+          <w:rFonts w:ascii="Calibri" w:hAnsi="Calibri" w:cs="Calibri"/>
+        </w:rPr>
+      </w:pPr>
+    </w:p>
+    <w:p>
+      <w:pPr>
+        <w:rPr>
+          <w:rFonts w:ascii="Calibri" w:hAnsi="Calibri" w:cs="Calibri"/>
+        </w:rPr>
+      </w:pPr>
+      <w:proofErr w:type="spellStart"/>
+      <w:r>
+        <w:rPr>
+          <w:rFonts w:ascii="Calibri" w:hAnsi="Calibri" w:cs="Calibri"/>
+        </w:rPr>
+        <w:t>data$Risk</w:t>
+      </w:r>
+      <w:proofErr w:type="spellEnd"/>
+      <w:r>
+        <w:rPr>
+          <w:rFonts w:ascii="Calibri" w:hAnsi="Calibri" w:cs="Calibri"/>
+        </w:rPr>
+        <w:t xml:space="preserve"> &lt;- </w:t>
+      </w:r>
+      <w:proofErr w:type="spellStart"/>
+      <w:r>
+        <w:rPr>
+          <w:rFonts w:ascii="Calibri" w:hAnsi="Calibri" w:cs="Calibri"/>
+        </w:rPr>
+        <w:t>data$Cases</w:t>
+      </w:r>
+      <w:proofErr w:type="spellEnd"/>
+      <w:r>
+        <w:rPr>
+          <w:rFonts w:ascii="Calibri" w:hAnsi="Calibri" w:cs="Calibri"/>
+        </w:rPr>
+        <w:t xml:space="preserve"> / </w:t>
+      </w:r>
+      <w:proofErr w:type="spellStart"/>
+      <w:r>
+        <w:rPr>
+          <w:rFonts w:ascii="Calibri" w:hAnsi="Calibri" w:cs="Calibri"/>
+        </w:rPr>
+        <w:t>data$Population</w:t>
+      </w:r>
+      <w:proofErr w:type="spellEnd"/>
+    </w:p>
+    <w:p>
+      <w:pPr>
+        <w:rPr>
+          <w:rFonts w:ascii="Calibri" w:hAnsi="Calibri" w:cs="Calibri"/>
+        </w:rPr>
+      </w:pPr>
+    </w:p>
+    <w:p>
+      <w:pPr>
+        <w:rPr>
+          <w:rFonts w:ascii="Calibri" w:hAnsi="Calibri" w:cs="Calibri"/>
+        </w:rPr>
+      </w:pPr>
+      <w:r>
+        <w:rPr>
+          <w:rFonts w:ascii="Calibri" w:hAnsi="Calibri" w:cs="Calibri"/>
+        </w:rPr>
+        <w:t>data</w:t>
+      </w:r>
+    </w:p>
+    <w:p>
+      <w:pPr>
+        <w:rPr>
+          <w:rFonts w:ascii="Calibri" w:hAnsi="Calibri" w:cs="Calibri"/>
+        </w:rPr>
+      </w:pPr>
+    </w:p>
+    <w:p>
+      <w:pPr>
+        <w:rPr>
+          <w:rFonts w:ascii="Calibri" w:hAnsi="Calibri" w:cs="Calibri"/>
+        </w:rPr>
+      </w:pPr>
+      <w:r>
+        <w:rPr>
+          <w:rFonts w:ascii="Calibri" w:hAnsi="Calibri" w:cs="Calibri"/>
+        </w:rPr>
+        <w:t>END R Code</w:t>
+      </w:r>
+    </w:p>
+    <w:p>
+      <w:pPr>
+        <w:rPr>
+          <w:rFonts w:ascii="Calibri" w:hAnsi="Calibri" w:cs="Calibri"/>
+        </w:rPr>
+      </w:pPr>
+    </w:p>
+    <w:p>
+      <w:pPr>
+        <w:rPr>
+          <w:rFonts w:ascii="Calibri" w:hAnsi="Calibri" w:cs="Calibri"/>
+        </w:rPr>
+      </w:pPr>
+    </w:p>
+    <w:p>
+      <w:pPr>
+        <w:pStyle w:val="Heading2"/>
+        <w:rPr>
+          <w:rFonts w:ascii="Calibri" w:hAnsi="Calibri" w:cs="Calibri"/>
+        </w:rPr>
+      </w:pPr>
+      <w:r>
+        <w:rPr>
+          <w:rFonts w:ascii="Calibri" w:hAnsi="Calibri" w:cs="Calibri"/>
+        </w:rPr>
+        <w:t>Interpreting the Results</w:t>
+      </w:r>
+    </w:p>
+    <w:p>
+      <w:pPr>
+        <w:rPr>
+          <w:rFonts w:ascii="Calibri" w:hAnsi="Calibri" w:cs="Calibri"/>
+        </w:rPr>
+      </w:pPr>
+    </w:p>
+    <w:p>
+      <w:pPr>
+        <w:rPr>
+          <w:rFonts w:ascii="Calibri" w:hAnsi="Calibri" w:cs="Calibri"/>
+        </w:rPr>
+      </w:pPr>
+      <w:r>
+        <w:rPr>
+          <w:rFonts w:ascii="Calibri" w:hAnsi="Calibri" w:cs="Calibri"/>
+        </w:rPr>
+        <w:t>Tabs</w:t>
       </w:r>
       <w:r>
         <w:rPr>
           <w:rFonts w:ascii="Calibri" w:hAnsi="Calibri" w:cs="Calibri"/>
         </w:rPr>
         <w:br/>
-        <w:t>cases &lt;- c(5, 25)</w:t>
-      </w:r>
-      <w:r>
-        <w:rPr>
-          <w:rFonts w:ascii="Calibri" w:hAnsi="Calibri" w:cs="Calibri"/>
-        </w:rPr>
-        <w:br/>
-        <w:t>population &lt;- c(500, 500)</w:t>
-      </w:r>
-      <w:r>
-        <w:rPr>
-          <w:rFonts w:ascii="Calibri" w:hAnsi="Calibri" w:cs="Calibri"/>
-        </w:rPr>
-        <w:br/>
-        <w:t>risk &lt;- cases / population</w:t>
-      </w:r>
-      <w:r>
-        <w:rPr>
-          <w:rFonts w:ascii="Calibri" w:hAnsi="Calibri" w:cs="Calibri"/>
-        </w:rPr>
-        <w:br/>
-      </w:r>
-      <w:proofErr w:type="spellStart"/>
-      <w:r>
-        <w:rPr>
-          <w:rFonts w:ascii="Calibri" w:hAnsi="Calibri" w:cs="Calibri"/>
-        </w:rPr>
-        <w:t>barplot</w:t>
-      </w:r>
-      <w:proofErr w:type="spellEnd"/>
-      <w:r>
-        <w:rPr>
-          <w:rFonts w:ascii="Calibri" w:hAnsi="Calibri" w:cs="Calibri"/>
-        </w:rPr>
-        <w:t xml:space="preserve">(risk, </w:t>
-      </w:r>
-      <w:proofErr w:type="spellStart"/>
-      <w:r>
-        <w:rPr>
-          <w:rFonts w:ascii="Calibri" w:hAnsi="Calibri" w:cs="Calibri"/>
-        </w:rPr>
-        <w:t>names.arg</w:t>
-      </w:r>
-      <w:proofErr w:type="spellEnd"/>
-      <w:r>
-        <w:rPr>
-          <w:rFonts w:ascii="Calibri" w:hAnsi="Calibri" w:cs="Calibri"/>
-        </w:rPr>
-        <w:t xml:space="preserve"> = group, col = c("</w:t>
-      </w:r>
-      <w:proofErr w:type="spellStart"/>
-      <w:r>
-        <w:rPr>
-          <w:rFonts w:ascii="Calibri" w:hAnsi="Calibri" w:cs="Calibri"/>
-        </w:rPr>
-        <w:t>steelblue</w:t>
-      </w:r>
-      <w:proofErr w:type="spellEnd"/>
-      <w:r>
-        <w:rPr>
-          <w:rFonts w:ascii="Calibri" w:hAnsi="Calibri" w:cs="Calibri"/>
-        </w:rPr>
-        <w:t>", "tomato"),</w:t>
-      </w:r>
-      <w:r>
-        <w:rPr>
-          <w:rFonts w:ascii="Calibri" w:hAnsi="Calibri" w:cs="Calibri"/>
-        </w:rPr>
-        <w:br/>
-        <w:t>main = "Risk of Infection by Vaccination Status")</w:t>
-      </w:r>
-      <w:r>
-        <w:rPr>
-          <w:rFonts w:ascii="Calibri" w:hAnsi="Calibri" w:cs="Calibri"/>
-        </w:rPr>
-        <w:br/>
-      </w:r>
-    </w:p>
-    <w:p>
-      <w:pPr>
-        <w:rPr>
-          <w:rFonts w:ascii="Calibri" w:hAnsi="Calibri" w:cs="Calibri"/>
-        </w:rPr>
-      </w:pPr>
-      <w:r>
-        <w:rPr>
-          <w:rFonts w:ascii="Calibri" w:hAnsi="Calibri" w:cs="Calibri"/>
-        </w:rPr>
-        <w:t>END R Example</w:t>
-      </w:r>
-    </w:p>
-    <w:p>
-      <w:pPr>
-        <w:rPr>
-          <w:rFonts w:ascii="Calibri" w:hAnsi="Calibri" w:cs="Calibri"/>
-        </w:rPr>
-      </w:pPr>
-    </w:p>
-    <w:p>
-      <w:pPr>
-        <w:pStyle w:val="Heading2"/>
-        <w:rPr>
-          <w:rFonts w:ascii="Calibri" w:hAnsi="Calibri" w:cs="Calibri"/>
-        </w:rPr>
-      </w:pPr>
-      <w:r>
-        <w:rPr>
-          <w:rFonts w:ascii="Calibri" w:hAnsi="Calibri" w:cs="Calibri"/>
-        </w:rPr>
-        <w:t>Interpreting the Results</w:t>
-      </w:r>
-    </w:p>
-    <w:p>
-      <w:pPr>
-        <w:rPr>
-          <w:rFonts w:ascii="Calibri" w:hAnsi="Calibri" w:cs="Calibri"/>
-        </w:rPr>
-      </w:pPr>
-    </w:p>
-    <w:p>
-      <w:pPr>
-        <w:rPr>
-          <w:rFonts w:ascii="Calibri" w:hAnsi="Calibri" w:cs="Calibri"/>
-        </w:rPr>
-      </w:pPr>
-      <w:r>
-        <w:rPr>
-          <w:rFonts w:ascii="Calibri" w:hAnsi="Calibri" w:cs="Calibri"/>
-        </w:rPr>
-        <w:t>Tabs</w:t>
-      </w:r>
-      <w:r>
-        <w:rPr>
-          <w:rFonts w:ascii="Calibri" w:hAnsi="Calibri" w:cs="Calibri"/>
-        </w:rPr>
-        <w:br/>
-      </w:r>
-      <w:proofErr w:type="gramStart"/>
-      <w:r>
-        <w:rPr>
-          <w:rFonts w:ascii="Calibri" w:hAnsi="Calibri" w:cs="Calibri"/>
-        </w:rPr>
-        <w:t>Interpretation :</w:t>
-      </w:r>
-      <w:proofErr w:type="gramEnd"/>
-      <w:r>
-        <w:rPr>
-          <w:rFonts w:ascii="Calibri" w:hAnsi="Calibri" w:cs="Calibri"/>
-        </w:rPr>
-        <w:t>: An 80% vaccine effectiveness means vaccinated individuals have substantially lower risk compared to unvaccinated individuals.</w:t>
+        <w:t>Interpretation :: An 80% vaccine effectiveness means vaccinated individuals have substantially lower risk compared to unvaccinated individuals.</w:t>
       </w:r>
       <w:r>
         <w:rPr>
@@ -1673,20 +2700,12 @@
           <w:rFonts w:ascii="Calibri" w:hAnsi="Calibri" w:cs="Calibri"/>
         </w:rPr>
       </w:pPr>
-      <w:proofErr w:type="gramStart"/>
       <w:r>
         <w:rPr>
           <w:rFonts w:ascii="Calibri" w:hAnsi="Calibri" w:cs="Calibri"/>
         </w:rPr>
         <w:lastRenderedPageBreak/>
-        <w:t>Image :</w:t>
-      </w:r>
-      <w:proofErr w:type="gramEnd"/>
-      <w:r>
-        <w:rPr>
-          <w:rFonts w:ascii="Calibri" w:hAnsi="Calibri" w:cs="Calibri"/>
-        </w:rPr>
-        <w:t>: resources/images/epidemic-curve.png</w:t>
+        <w:t>Image :: resources/images/epidemic-curve.png</w:t>
       </w:r>
       <w:r>
         <w:rPr>
@@ -1700,27 +2719,14 @@
           <w:rFonts w:ascii="Calibri" w:hAnsi="Calibri" w:cs="Calibri"/>
         </w:rPr>
         <w:br/>
-        <w:t>Caption :: Figure 1. Epidemic curve comparing vaccinated and unvaccinated groups.</w:t>
+        <w:t>Caption :: Epidemic curve comparing vaccinated and unvaccinated groups.</w:t>
       </w:r>
       <w:r>
         <w:rPr>
           <w:rFonts w:ascii="Calibri" w:hAnsi="Calibri" w:cs="Calibri"/>
         </w:rPr>
         <w:br/>
-      </w:r>
-      <w:proofErr w:type="gramStart"/>
-      <w:r>
-        <w:rPr>
-          <w:rFonts w:ascii="Calibri" w:hAnsi="Calibri" w:cs="Calibri"/>
-        </w:rPr>
-        <w:t>Width :</w:t>
-      </w:r>
-      <w:proofErr w:type="gramEnd"/>
-      <w:r>
-        <w:rPr>
-          <w:rFonts w:ascii="Calibri" w:hAnsi="Calibri" w:cs="Calibri"/>
-        </w:rPr>
-        <w:t>: 70%</w:t>
+        <w:t>Width :: 70%</w:t>
       </w:r>
     </w:p>
     <w:p>
@@ -1768,19 +2774,11 @@
           <w:rFonts w:ascii="Calibri" w:hAnsi="Calibri" w:cs="Calibri"/>
         </w:rPr>
       </w:pPr>
-      <w:proofErr w:type="gramStart"/>
-      <w:r>
-        <w:rPr>
-          <w:rFonts w:ascii="Calibri" w:hAnsi="Calibri" w:cs="Calibri"/>
-        </w:rPr>
-        <w:t>File :</w:t>
-      </w:r>
-      <w:proofErr w:type="gramEnd"/>
-      <w:r>
-        <w:rPr>
-          <w:rFonts w:ascii="Calibri" w:hAnsi="Calibri" w:cs="Calibri"/>
-        </w:rPr>
-        <w:t>: resources/pdf/outbreak-report.pdf</w:t>
+      <w:r>
+        <w:rPr>
+          <w:rFonts w:ascii="Calibri" w:hAnsi="Calibri" w:cs="Calibri"/>
+        </w:rPr>
+        <w:t>File :: resources/pdf/outbreak-report.pdf</w:t>
       </w:r>
       <w:r>
         <w:rPr>
@@ -1831,19 +2829,11 @@
           <w:rFonts w:ascii="Calibri" w:hAnsi="Calibri" w:cs="Calibri"/>
         </w:rPr>
       </w:pPr>
-      <w:proofErr w:type="gramStart"/>
-      <w:r>
-        <w:rPr>
-          <w:rFonts w:ascii="Calibri" w:hAnsi="Calibri" w:cs="Calibri"/>
-        </w:rPr>
-        <w:t>File :</w:t>
-      </w:r>
-      <w:proofErr w:type="gramEnd"/>
-      <w:r>
-        <w:rPr>
-          <w:rFonts w:ascii="Calibri" w:hAnsi="Calibri" w:cs="Calibri"/>
-        </w:rPr>
-        <w:t>: resources/data/outbreak-dataset.zip</w:t>
+      <w:r>
+        <w:rPr>
+          <w:rFonts w:ascii="Calibri" w:hAnsi="Calibri" w:cs="Calibri"/>
+        </w:rPr>
+        <w:t>File :: resources/data/outbreak-dataset.zip</w:t>
       </w:r>
       <w:r>
         <w:rPr>
@@ -1892,146 +2882,85 @@
           <w:rFonts w:ascii="Calibri" w:hAnsi="Calibri" w:cs="Calibri"/>
         </w:rPr>
         <w:br/>
-      </w:r>
-      <w:proofErr w:type="gramStart"/>
-      <w:r>
-        <w:rPr>
-          <w:rFonts w:ascii="Calibri" w:hAnsi="Calibri" w:cs="Calibri"/>
-        </w:rPr>
-        <w:t>Question :</w:t>
-      </w:r>
-      <w:proofErr w:type="gramEnd"/>
-      <w:r>
-        <w:rPr>
-          <w:rFonts w:ascii="Calibri" w:hAnsi="Calibri" w:cs="Calibri"/>
-        </w:rPr>
-        <w:t>: Based on the outbreak data, what does a vaccine effectiveness of 80% mean in practice?</w:t>
-      </w:r>
-    </w:p>
-    <w:p>
-      <w:pPr>
-        <w:rPr>
-          <w:rFonts w:ascii="Calibri" w:hAnsi="Calibri" w:cs="Calibri"/>
-        </w:rPr>
-      </w:pPr>
-      <w:proofErr w:type="gramStart"/>
-      <w:r>
-        <w:rPr>
-          <w:rFonts w:ascii="Calibri" w:hAnsi="Calibri" w:cs="Calibri"/>
-        </w:rPr>
-        <w:t>Option :</w:t>
-      </w:r>
-      <w:proofErr w:type="gramEnd"/>
-      <w:r>
-        <w:rPr>
-          <w:rFonts w:ascii="Calibri" w:hAnsi="Calibri" w:cs="Calibri"/>
-        </w:rPr>
-        <w:t>: Vaccinated individuals have zero risk of infection</w:t>
-      </w:r>
-    </w:p>
-    <w:p>
-      <w:pPr>
-        <w:rPr>
-          <w:rFonts w:ascii="Calibri" w:hAnsi="Calibri" w:cs="Calibri"/>
-        </w:rPr>
-      </w:pPr>
-      <w:proofErr w:type="gramStart"/>
-      <w:r>
-        <w:rPr>
-          <w:rFonts w:ascii="Calibri" w:hAnsi="Calibri" w:cs="Calibri"/>
-        </w:rPr>
-        <w:t>Option :</w:t>
-      </w:r>
-      <w:proofErr w:type="gramEnd"/>
-      <w:r>
-        <w:rPr>
-          <w:rFonts w:ascii="Calibri" w:hAnsi="Calibri" w:cs="Calibri"/>
-        </w:rPr>
-        <w:t>: Vaccinated individuals have an 80% lower risk of infection than unvaccinated individuals</w:t>
-      </w:r>
-    </w:p>
-    <w:p>
-      <w:pPr>
-        <w:rPr>
-          <w:rFonts w:ascii="Calibri" w:hAnsi="Calibri" w:cs="Calibri"/>
-        </w:rPr>
-      </w:pPr>
-      <w:proofErr w:type="gramStart"/>
-      <w:r>
-        <w:rPr>
-          <w:rFonts w:ascii="Calibri" w:hAnsi="Calibri" w:cs="Calibri"/>
-        </w:rPr>
-        <w:t>Option :</w:t>
-      </w:r>
-      <w:proofErr w:type="gramEnd"/>
-      <w:r>
-        <w:rPr>
-          <w:rFonts w:ascii="Calibri" w:hAnsi="Calibri" w:cs="Calibri"/>
-        </w:rPr>
-        <w:t>: 80% of vaccinated individuals will not become infected</w:t>
-      </w:r>
-    </w:p>
-    <w:p>
-      <w:pPr>
-        <w:rPr>
-          <w:rFonts w:ascii="Calibri" w:hAnsi="Calibri" w:cs="Calibri"/>
-        </w:rPr>
-      </w:pPr>
-      <w:proofErr w:type="gramStart"/>
-      <w:r>
-        <w:rPr>
-          <w:rFonts w:ascii="Calibri" w:hAnsi="Calibri" w:cs="Calibri"/>
-        </w:rPr>
-        <w:t>Option :</w:t>
-      </w:r>
-      <w:proofErr w:type="gramEnd"/>
-      <w:r>
-        <w:rPr>
-          <w:rFonts w:ascii="Calibri" w:hAnsi="Calibri" w:cs="Calibri"/>
-        </w:rPr>
-        <w:t>: The vaccine prevents 80 cases in every outbreak regardless of context</w:t>
-      </w:r>
-    </w:p>
-    <w:p>
-      <w:pPr>
-        <w:rPr>
-          <w:rFonts w:ascii="Calibri" w:hAnsi="Calibri" w:cs="Calibri"/>
-        </w:rPr>
-      </w:pPr>
-      <w:proofErr w:type="gramStart"/>
-      <w:r>
-        <w:rPr>
-          <w:rFonts w:ascii="Calibri" w:hAnsi="Calibri" w:cs="Calibri"/>
-        </w:rPr>
-        <w:t>Answer :</w:t>
-      </w:r>
-      <w:proofErr w:type="gramEnd"/>
-      <w:r>
-        <w:rPr>
-          <w:rFonts w:ascii="Calibri" w:hAnsi="Calibri" w:cs="Calibri"/>
-        </w:rPr>
-        <w:t>: Vaccinated individuals have an 80% lower risk of infection than unvaccinated individuals</w:t>
-      </w:r>
-    </w:p>
-    <w:p>
-      <w:pPr>
-        <w:rPr>
-          <w:rFonts w:ascii="Calibri" w:hAnsi="Calibri" w:cs="Calibri"/>
-        </w:rPr>
-      </w:pPr>
-      <w:proofErr w:type="gramStart"/>
-      <w:r>
-        <w:rPr>
-          <w:rFonts w:ascii="Calibri" w:hAnsi="Calibri" w:cs="Calibri"/>
-        </w:rPr>
-        <w:t>Explanation :</w:t>
-      </w:r>
-      <w:proofErr w:type="gramEnd"/>
-      <w:r>
-        <w:rPr>
-          <w:rFonts w:ascii="Calibri" w:hAnsi="Calibri" w:cs="Calibri"/>
-        </w:rPr>
-        <w:t>: Vaccine effectiveness compares the risk of disease in vaccinated and unvaccinated groups under real-world conditions. An 80% VE means the vaccinated group experienced substantially lower risk, not that infection risk was eliminated entirely.</w:t>
+        <w:t>Question :: Based on the outbreak data, what does a vaccine effectiveness of 80% mean in practice?</w:t>
+      </w:r>
+    </w:p>
+    <w:p>
+      <w:pPr>
+        <w:rPr>
+          <w:rFonts w:ascii="Calibri" w:hAnsi="Calibri" w:cs="Calibri"/>
+        </w:rPr>
+      </w:pPr>
+      <w:r>
+        <w:rPr>
+          <w:rFonts w:ascii="Calibri" w:hAnsi="Calibri" w:cs="Calibri"/>
+        </w:rPr>
+        <w:t>Option :: Vaccinated individuals have zero risk of infection</w:t>
+      </w:r>
+    </w:p>
+    <w:p>
+      <w:pPr>
+        <w:rPr>
+          <w:rFonts w:ascii="Calibri" w:hAnsi="Calibri" w:cs="Calibri"/>
+        </w:rPr>
+      </w:pPr>
+      <w:r>
+        <w:rPr>
+          <w:rFonts w:ascii="Calibri" w:hAnsi="Calibri" w:cs="Calibri"/>
+        </w:rPr>
+        <w:t>Option :: Vaccinated individuals have an 80% lower risk of infection than unvaccinated individuals</w:t>
+      </w:r>
+    </w:p>
+    <w:p>
+      <w:pPr>
+        <w:rPr>
+          <w:rFonts w:ascii="Calibri" w:hAnsi="Calibri" w:cs="Calibri"/>
+        </w:rPr>
+      </w:pPr>
+      <w:r>
+        <w:rPr>
+          <w:rFonts w:ascii="Calibri" w:hAnsi="Calibri" w:cs="Calibri"/>
+        </w:rPr>
+        <w:t>Option :: 80% of vaccinated individuals will not become infected</w:t>
+      </w:r>
+    </w:p>
+    <w:p>
+      <w:pPr>
+        <w:rPr>
+          <w:rFonts w:ascii="Calibri" w:hAnsi="Calibri" w:cs="Calibri"/>
+        </w:rPr>
+      </w:pPr>
+      <w:r>
+        <w:rPr>
+          <w:rFonts w:ascii="Calibri" w:hAnsi="Calibri" w:cs="Calibri"/>
+        </w:rPr>
+        <w:t>Option :: The vaccine prevents 80 cases in every outbreak regardless of context</w:t>
+      </w:r>
+    </w:p>
+    <w:p>
+      <w:pPr>
+        <w:rPr>
+          <w:rFonts w:ascii="Calibri" w:hAnsi="Calibri" w:cs="Calibri"/>
+        </w:rPr>
+      </w:pPr>
+      <w:r>
+        <w:rPr>
+          <w:rFonts w:ascii="Calibri" w:hAnsi="Calibri" w:cs="Calibri"/>
+        </w:rPr>
+        <w:t>Answer :: Vaccinated individuals have an 80% lower risk of infection than unvaccinated individuals</w:t>
+      </w:r>
+    </w:p>
+    <w:p>
+      <w:pPr>
+        <w:rPr>
+          <w:rFonts w:ascii="Calibri" w:hAnsi="Calibri" w:cs="Calibri"/>
+        </w:rPr>
+      </w:pPr>
+      <w:r>
+        <w:rPr>
+          <w:rFonts w:ascii="Calibri" w:hAnsi="Calibri" w:cs="Calibri"/>
+        </w:rPr>
+        <w:t>Explanation :: Vaccine effectiveness compares the risk of disease in vaccinated and unvaccinated groups under real-world conditions. An 80% VE means the vaccinated group experienced substantially lower risk, not that infection risk was eliminated entirely.</w:t>
       </w:r>
     </w:p>
     <w:p>
@@ -2069,19 +2998,11 @@
           <w:rFonts w:ascii="Calibri" w:hAnsi="Calibri" w:cs="Calibri"/>
         </w:rPr>
       </w:pPr>
-      <w:proofErr w:type="gramStart"/>
-      <w:r>
-        <w:rPr>
-          <w:rFonts w:ascii="Calibri" w:hAnsi="Calibri" w:cs="Calibri"/>
-        </w:rPr>
-        <w:t>Callout :</w:t>
-      </w:r>
-      <w:proofErr w:type="gramEnd"/>
-      <w:r>
-        <w:rPr>
-          <w:rFonts w:ascii="Calibri" w:hAnsi="Calibri" w:cs="Calibri"/>
-        </w:rPr>
-        <w:t>: tip</w:t>
+      <w:r>
+        <w:rPr>
+          <w:rFonts w:ascii="Calibri" w:hAnsi="Calibri" w:cs="Calibri"/>
+        </w:rPr>
+        <w:t>Callout :: tip</w:t>
       </w:r>
       <w:r>
         <w:rPr>
@@ -2100,6 +3021,27 @@
     </w:p>
     <w:p>
       <w:pPr>
+        <w:rPr>
+          <w:rFonts w:ascii="Calibri" w:hAnsi="Calibri" w:cs="Calibri"/>
+        </w:rPr>
+      </w:pPr>
+    </w:p>
+    <w:p>
+      <w:pPr>
+        <w:rPr>
+          <w:rFonts w:ascii="Calibri" w:hAnsi="Calibri" w:cs="Calibri"/>
+        </w:rPr>
+      </w:pPr>
+    </w:p>
+    <w:p>
+      <w:pPr>
+        <w:rPr>
+          <w:rFonts w:ascii="Calibri" w:hAnsi="Calibri" w:cs="Calibri"/>
+        </w:rPr>
+      </w:pPr>
+    </w:p>
+    <w:p>
+      <w:pPr>
         <w:pStyle w:val="Heading2"/>
         <w:rPr>
           <w:rFonts w:ascii="Calibri" w:hAnsi="Calibri" w:cs="Calibri"/>
@@ -2110,6 +3052,321 @@
           <w:rFonts w:ascii="Calibri" w:hAnsi="Calibri" w:cs="Calibri"/>
         </w:rPr>
         <w:lastRenderedPageBreak/>
+        <w:t>Binomial Theorem equation</w:t>
+      </w:r>
+    </w:p>
+    <w:p>
+      <w:pPr>
+        <w:rPr>
+          <w:rFonts w:ascii="Calibri" w:eastAsiaTheme="majorEastAsia" w:hAnsi="Calibri" w:cs="Calibri"/>
+        </w:rPr>
+      </w:pPr>
+    </w:p>
+    <w:p>
+      <w:pPr>
+        <w:rPr>
+          <w:rFonts w:ascii="Calibri" w:eastAsiaTheme="majorEastAsia" w:hAnsi="Calibri" w:cs="Calibri"/>
+        </w:rPr>
+      </w:pPr>
+      <m:oMathPara>
+        <m:oMath>
+          <m:sSup>
+            <m:sSupPr>
+              <m:ctrlPr>
+                <w:rPr>
+                  <w:rFonts w:ascii="Cambria Math" w:eastAsiaTheme="majorEastAsia" w:hAnsi="Cambria Math" w:cs="Calibri"/>
+                </w:rPr>
+              </m:ctrlPr>
+            </m:sSupPr>
+            <m:e>
+              <m:d>
+                <m:dPr>
+                  <m:ctrlPr>
+                    <w:rPr>
+                      <w:rFonts w:ascii="Cambria Math" w:eastAsiaTheme="majorEastAsia" w:hAnsi="Cambria Math" w:cs="Calibri"/>
+                    </w:rPr>
+                  </m:ctrlPr>
+                </m:dPr>
+                <m:e>
+                  <m:r>
+                    <w:rPr>
+                      <w:rFonts w:ascii="Cambria Math" w:eastAsiaTheme="majorEastAsia" w:hAnsi="Cambria Math" w:cs="Calibri"/>
+                    </w:rPr>
+                    <m:t>x+a</m:t>
+                  </m:r>
+                </m:e>
+              </m:d>
+            </m:e>
+            <m:sup>
+              <m:r>
+                <w:rPr>
+                  <w:rFonts w:ascii="Cambria Math" w:eastAsiaTheme="majorEastAsia" w:hAnsi="Cambria Math" w:cs="Calibri"/>
+                </w:rPr>
+                <m:t>n</m:t>
+              </m:r>
+            </m:sup>
+          </m:sSup>
+          <m:r>
+            <w:rPr>
+              <w:rFonts w:ascii="Cambria Math" w:eastAsia="Cambria Math" w:hAnsi="Cambria Math" w:cs="Calibri"/>
+            </w:rPr>
+            <m:t>=</m:t>
+          </m:r>
+          <m:nary>
+            <m:naryPr>
+              <m:chr m:val="∑"/>
+              <m:grow m:val="1"/>
+              <m:ctrlPr>
+                <w:rPr>
+                  <w:rFonts w:ascii="Cambria Math" w:eastAsiaTheme="majorEastAsia" w:hAnsi="Cambria Math" w:cs="Calibri"/>
+                </w:rPr>
+              </m:ctrlPr>
+            </m:naryPr>
+            <m:sub>
+              <m:r>
+                <w:rPr>
+                  <w:rFonts w:ascii="Cambria Math" w:eastAsia="Cambria Math" w:hAnsi="Cambria Math" w:cs="Calibri"/>
+                </w:rPr>
+                <m:t>k=0</m:t>
+              </m:r>
+            </m:sub>
+            <m:sup>
+              <m:r>
+                <w:rPr>
+                  <w:rFonts w:ascii="Cambria Math" w:eastAsia="Cambria Math" w:hAnsi="Cambria Math" w:cs="Calibri"/>
+                </w:rPr>
+                <m:t>n</m:t>
+              </m:r>
+            </m:sup>
+            <m:e>
+              <m:d>
+                <m:dPr>
+                  <m:ctrlPr>
+                    <w:rPr>
+                      <w:rFonts w:ascii="Cambria Math" w:eastAsiaTheme="majorEastAsia" w:hAnsi="Cambria Math" w:cs="Calibri"/>
+                    </w:rPr>
+                  </m:ctrlPr>
+                </m:dPr>
+                <m:e>
+                  <m:f>
+                    <m:fPr>
+                      <m:type m:val="noBar"/>
+                      <m:ctrlPr>
+                        <w:rPr>
+                          <w:rFonts w:ascii="Cambria Math" w:eastAsiaTheme="majorEastAsia" w:hAnsi="Cambria Math" w:cs="Calibri"/>
+                        </w:rPr>
+                      </m:ctrlPr>
+                    </m:fPr>
+                    <m:num>
+                      <m:r>
+                        <w:rPr>
+                          <w:rFonts w:ascii="Cambria Math" w:eastAsia="Cambria Math" w:hAnsi="Cambria Math" w:cs="Calibri"/>
+                        </w:rPr>
+                        <m:t>n</m:t>
+                      </m:r>
+                    </m:num>
+                    <m:den>
+                      <m:r>
+                        <w:rPr>
+                          <w:rFonts w:ascii="Cambria Math" w:eastAsia="Cambria Math" w:hAnsi="Cambria Math" w:cs="Calibri"/>
+                        </w:rPr>
+                        <m:t>k</m:t>
+                      </m:r>
+                    </m:den>
+                  </m:f>
+                </m:e>
+              </m:d>
+              <m:sSup>
+                <m:sSupPr>
+                  <m:ctrlPr>
+                    <w:rPr>
+                      <w:rFonts w:ascii="Cambria Math" w:eastAsiaTheme="majorEastAsia" w:hAnsi="Cambria Math" w:cs="Calibri"/>
+                    </w:rPr>
+                  </m:ctrlPr>
+                </m:sSupPr>
+                <m:e>
+                  <m:r>
+                    <w:rPr>
+                      <w:rFonts w:ascii="Cambria Math" w:eastAsia="Cambria Math" w:hAnsi="Cambria Math" w:cs="Calibri"/>
+                    </w:rPr>
+                    <m:t>x</m:t>
+                  </m:r>
+                </m:e>
+                <m:sup>
+                  <m:r>
+                    <w:rPr>
+                      <w:rFonts w:ascii="Cambria Math" w:eastAsia="Cambria Math" w:hAnsi="Cambria Math" w:cs="Calibri"/>
+                    </w:rPr>
+                    <m:t>k</m:t>
+                  </m:r>
+                </m:sup>
+              </m:sSup>
+              <m:sSup>
+                <m:sSupPr>
+                  <m:ctrlPr>
+                    <w:rPr>
+                      <w:rFonts w:ascii="Cambria Math" w:eastAsiaTheme="majorEastAsia" w:hAnsi="Cambria Math" w:cs="Calibri"/>
+                    </w:rPr>
+                  </m:ctrlPr>
+                </m:sSupPr>
+                <m:e>
+                  <m:r>
+                    <w:rPr>
+                      <w:rFonts w:ascii="Cambria Math" w:eastAsia="Cambria Math" w:hAnsi="Cambria Math" w:cs="Calibri"/>
+                    </w:rPr>
+                    <m:t>a</m:t>
+                  </m:r>
+                </m:e>
+                <m:sup>
+                  <m:r>
+                    <w:rPr>
+                      <w:rFonts w:ascii="Cambria Math" w:eastAsia="Cambria Math" w:hAnsi="Cambria Math" w:cs="Calibri"/>
+                    </w:rPr>
+                    <m:t>n-k</m:t>
+                  </m:r>
+                </m:sup>
+              </m:sSup>
+            </m:e>
+          </m:nary>
+        </m:oMath>
+      </m:oMathPara>
+    </w:p>
+    <w:p>
+      <w:pPr>
+        <w:rPr>
+          <w:rFonts w:ascii="Calibri" w:eastAsiaTheme="majorEastAsia" w:hAnsi="Calibri" w:cs="Calibri"/>
+        </w:rPr>
+      </w:pPr>
+    </w:p>
+    <w:p>
+      <w:pPr>
+        <w:pStyle w:val="Heading2"/>
+        <w:rPr>
+          <w:rFonts w:ascii="Calibri" w:hAnsi="Calibri" w:cs="Calibri"/>
+        </w:rPr>
+      </w:pPr>
+      <w:r>
+        <w:rPr>
+          <w:rFonts w:ascii="Calibri" w:hAnsi="Calibri" w:cs="Calibri"/>
+        </w:rPr>
+        <w:t>Latex Equations Approach</w:t>
+      </w:r>
+    </w:p>
+    <w:p>
+      <w:pPr>
+        <w:rPr>
+          <w:rFonts w:ascii="Calibri" w:eastAsiaTheme="majorEastAsia" w:hAnsi="Calibri" w:cs="Calibri"/>
+        </w:rPr>
+      </w:pPr>
+    </w:p>
+    <w:p>
+      <w:pPr>
+        <w:rPr>
+          <w:rFonts w:ascii="Calibri" w:eastAsiaTheme="majorEastAsia" w:hAnsi="Calibri" w:cs="Calibri"/>
+        </w:rPr>
+      </w:pPr>
+    </w:p>
+    <w:p>
+      <w:pPr>
+        <w:rPr>
+          <w:rFonts w:ascii="Calibri" w:eastAsiaTheme="majorEastAsia" w:hAnsi="Calibri" w:cs="Calibri"/>
+          <w:b/>
+          <w:bCs/>
+        </w:rPr>
+      </w:pPr>
+      <w:r>
+        <w:rPr>
+          <w:rFonts w:ascii="Calibri" w:eastAsiaTheme="majorEastAsia" w:hAnsi="Calibri" w:cs="Calibri"/>
+          <w:b/>
+          <w:bCs/>
+        </w:rPr>
+        <w:t xml:space="preserve">Display equation example </w:t>
+      </w:r>
+    </w:p>
+    <w:p>
+      <w:pPr>
+        <w:rPr>
+          <w:rFonts w:ascii="Calibri" w:eastAsiaTheme="majorEastAsia" w:hAnsi="Calibri" w:cs="Calibri"/>
+        </w:rPr>
+      </w:pPr>
+    </w:p>
+    <w:p>
+      <w:pPr>
+        <w:rPr>
+          <w:rFonts w:ascii="Calibri" w:hAnsi="Calibri" w:cs="Calibri"/>
+        </w:rPr>
+      </w:pPr>
+      <w:r>
+        <w:rPr>
+          <w:rFonts w:ascii="Calibri" w:hAnsi="Calibri" w:cs="Calibri"/>
+        </w:rPr>
+        <w:t>$$</w:t>
+      </w:r>
+      <w:r>
+        <w:rPr>
+          <w:rFonts w:ascii="Calibri" w:hAnsi="Calibri" w:cs="Calibri"/>
+        </w:rPr>
+        <w:br/>
+        <w:t>P(X=x)=\</w:t>
+      </w:r>
+      <w:proofErr w:type="spellStart"/>
+      <w:r>
+        <w:rPr>
+          <w:rFonts w:ascii="Calibri" w:hAnsi="Calibri" w:cs="Calibri"/>
+        </w:rPr>
+        <w:t>binom</w:t>
+      </w:r>
+      <w:proofErr w:type="spellEnd"/>
+      <w:r>
+        <w:rPr>
+          <w:rFonts w:ascii="Calibri" w:hAnsi="Calibri" w:cs="Calibri"/>
+        </w:rPr>
+        <w:t>{n}{x}</w:t>
+      </w:r>
+      <w:proofErr w:type="spellStart"/>
+      <w:r>
+        <w:rPr>
+          <w:rFonts w:ascii="Calibri" w:hAnsi="Calibri" w:cs="Calibri"/>
+        </w:rPr>
+        <w:t>p^x</w:t>
+      </w:r>
+      <w:proofErr w:type="spellEnd"/>
+      <w:r>
+        <w:rPr>
+          <w:rFonts w:ascii="Calibri" w:hAnsi="Calibri" w:cs="Calibri"/>
+        </w:rPr>
+        <w:t>(1-p)^{n-x}</w:t>
+      </w:r>
+      <w:r>
+        <w:rPr>
+          <w:rFonts w:ascii="Calibri" w:hAnsi="Calibri" w:cs="Calibri"/>
+        </w:rPr>
+        <w:br/>
+        <w:t>$$</w:t>
+      </w:r>
+    </w:p>
+    <w:p>
+      <w:pPr>
+        <w:pStyle w:val="Heading2"/>
+        <w:rPr>
+          <w:rFonts w:ascii="Calibri" w:hAnsi="Calibri" w:cs="Calibri"/>
+          <w:color w:val="auto"/>
+          <w:sz w:val="24"/>
+          <w:szCs w:val="24"/>
+        </w:rPr>
+      </w:pPr>
+    </w:p>
+    <w:p>
+      <w:pPr>
+        <w:pStyle w:val="Heading2"/>
+        <w:rPr>
+          <w:rFonts w:ascii="Calibri" w:hAnsi="Calibri" w:cs="Calibri"/>
+        </w:rPr>
+      </w:pPr>
+      <w:r>
+        <w:rPr>
+          <w:rFonts w:ascii="Calibri" w:hAnsi="Calibri" w:cs="Calibri"/>
+        </w:rPr>
         <w:t>Further Reading</w:t>
       </w:r>
     </w:p>
@@ -3705,6 +4962,7 @@
   <w:style w:type="character" w:default="1" w:styleId="DefaultParagraphFont">
     <w:name w:val="Default Paragraph Font"/>
     <w:uiPriority w:val="1"/>
+    <w:semiHidden/>
     <w:unhideWhenUsed/>
   </w:style>
   <w:style w:type="table" w:default="1" w:styleId="TableNormal">
@@ -4057,6 +5315,46 @@
       </w:tblBorders>
     </w:tblPr>
   </w:style>
+  <w:style w:type="character" w:styleId="PlaceholderText">
+    <w:name w:val="Placeholder Text"/>
+    <w:basedOn w:val="DefaultParagraphFont"/>
+    <w:uiPriority w:val="99"/>
+    <w:semiHidden/>
+    <w:rsid w:val="00786851"/>
+    <w:rPr>
+      <w:color w:val="666666"/>
+    </w:rPr>
+  </w:style>
+  <w:style w:type="paragraph" w:styleId="HTMLPreformatted">
+    <w:name w:val="HTML Preformatted"/>
+    <w:basedOn w:val="Normal"/>
+    <w:link w:val="HTMLPreformattedChar"/>
+    <w:uiPriority w:val="99"/>
+    <w:semiHidden/>
+    <w:unhideWhenUsed/>
+    <w:rsid w:val="007672C7"/>
+    <w:rPr>
+      <w:rFonts w:ascii="Consolas" w:hAnsi="Consolas"/>
+      <w:sz w:val="20"/>
+      <w:szCs w:val="20"/>
+    </w:rPr>
+  </w:style>
+  <w:style w:type="character" w:customStyle="1" w:styleId="HTMLPreformattedChar">
+    <w:name w:val="HTML Preformatted Char"/>
+    <w:basedOn w:val="DefaultParagraphFont"/>
+    <w:link w:val="HTMLPreformatted"/>
+    <w:uiPriority w:val="99"/>
+    <w:semiHidden/>
+    <w:rsid w:val="007672C7"/>
+    <w:rPr>
+      <w:rFonts w:ascii="Consolas" w:eastAsia="Times New Roman" w:hAnsi="Consolas" w:cs="Times New Roman"/>
+      <w:kern w:val="0"/>
+      <w:sz w:val="20"/>
+      <w:szCs w:val="20"/>
+      <w:lang w:eastAsia="en-GB"/>
+      <w14:ligatures w14:val="none"/>
+    </w:rPr>
+  </w:style>
 </w:styles>
 </file>
 

</xml_diff>